<commit_message>
Consolidate test suite: replace qa-tests and e2e-tests with focused 18-test qa-suite module
- New qa-suite/ module with Selenium UI (8), Rest Assured API (6), Cucumber BDD (4)

- PageFactory + raw findElement(By.xpath()) + TestNG groups and listeners

- Apache POI for both test data input (ExcelDataReader) and reporting output (ExcelReporter)

- ExtentReports HTML, Cucumber HTML, Excel, and TestNG default reports

- Cross-browser support via -Dbrowser= flag

- Adds Manual Testing Document and updated QA Suite Report

- Removes legacy qa-tests/ and e2e-tests/ modules
</commit_message>
<xml_diff>
--- a/reports/Ticketus_Project_Report.docx
+++ b/reports/Ticketus_Project_Report.docx
@@ -238,12 +238,6 @@
         <w:gridCol w:w="6360"/>
       </w:tblGrid>
       <w:tr>
-        <w:tblPrEx>
-          <w:tblCellMar>
-            <w:top w:w="0" w:type="dxa"/>
-            <w:bottom w:w="0" w:type="dxa"/>
-          </w:tblCellMar>
-        </w:tblPrEx>
         <w:tc>
           <w:tcPr>
             <w:tcW w:w="3000" w:type="dxa"/>
@@ -304,12 +298,6 @@
         </w:tc>
       </w:tr>
       <w:tr>
-        <w:tblPrEx>
-          <w:tblCellMar>
-            <w:top w:w="0" w:type="dxa"/>
-            <w:bottom w:w="0" w:type="dxa"/>
-          </w:tblCellMar>
-        </w:tblPrEx>
         <w:tc>
           <w:tcPr>
             <w:tcW w:w="3000" w:type="dxa"/>
@@ -364,12 +352,6 @@
         </w:tc>
       </w:tr>
       <w:tr>
-        <w:tblPrEx>
-          <w:tblCellMar>
-            <w:top w:w="0" w:type="dxa"/>
-            <w:bottom w:w="0" w:type="dxa"/>
-          </w:tblCellMar>
-        </w:tblPrEx>
         <w:tc>
           <w:tcPr>
             <w:tcW w:w="3000" w:type="dxa"/>
@@ -424,12 +406,6 @@
         </w:tc>
       </w:tr>
       <w:tr>
-        <w:tblPrEx>
-          <w:tblCellMar>
-            <w:top w:w="0" w:type="dxa"/>
-            <w:bottom w:w="0" w:type="dxa"/>
-          </w:tblCellMar>
-        </w:tblPrEx>
         <w:tc>
           <w:tcPr>
             <w:tcW w:w="3000" w:type="dxa"/>
@@ -484,12 +460,6 @@
         </w:tc>
       </w:tr>
       <w:tr>
-        <w:tblPrEx>
-          <w:tblCellMar>
-            <w:top w:w="0" w:type="dxa"/>
-            <w:bottom w:w="0" w:type="dxa"/>
-          </w:tblCellMar>
-        </w:tblPrEx>
         <w:tc>
           <w:tcPr>
             <w:tcW w:w="3000" w:type="dxa"/>
@@ -544,12 +514,6 @@
         </w:tc>
       </w:tr>
       <w:tr>
-        <w:tblPrEx>
-          <w:tblCellMar>
-            <w:top w:w="0" w:type="dxa"/>
-            <w:bottom w:w="0" w:type="dxa"/>
-          </w:tblCellMar>
-        </w:tblPrEx>
         <w:tc>
           <w:tcPr>
             <w:tcW w:w="3000" w:type="dxa"/>
@@ -604,12 +568,6 @@
         </w:tc>
       </w:tr>
       <w:tr>
-        <w:tblPrEx>
-          <w:tblCellMar>
-            <w:top w:w="0" w:type="dxa"/>
-            <w:bottom w:w="0" w:type="dxa"/>
-          </w:tblCellMar>
-        </w:tblPrEx>
         <w:tc>
           <w:tcPr>
             <w:tcW w:w="3000" w:type="dxa"/>
@@ -664,12 +622,6 @@
         </w:tc>
       </w:tr>
       <w:tr>
-        <w:tblPrEx>
-          <w:tblCellMar>
-            <w:top w:w="0" w:type="dxa"/>
-            <w:bottom w:w="0" w:type="dxa"/>
-          </w:tblCellMar>
-        </w:tblPrEx>
         <w:tc>
           <w:tcPr>
             <w:tcW w:w="3000" w:type="dxa"/>
@@ -724,12 +676,6 @@
         </w:tc>
       </w:tr>
       <w:tr>
-        <w:tblPrEx>
-          <w:tblCellMar>
-            <w:top w:w="0" w:type="dxa"/>
-            <w:bottom w:w="0" w:type="dxa"/>
-          </w:tblCellMar>
-        </w:tblPrEx>
         <w:tc>
           <w:tcPr>
             <w:tcW w:w="3000" w:type="dxa"/>
@@ -784,12 +730,6 @@
         </w:tc>
       </w:tr>
       <w:tr>
-        <w:tblPrEx>
-          <w:tblCellMar>
-            <w:top w:w="0" w:type="dxa"/>
-            <w:bottom w:w="0" w:type="dxa"/>
-          </w:tblCellMar>
-        </w:tblPrEx>
         <w:tc>
           <w:tcPr>
             <w:tcW w:w="3000" w:type="dxa"/>
@@ -897,12 +837,6 @@
         <w:gridCol w:w="5460"/>
       </w:tblGrid>
       <w:tr>
-        <w:tblPrEx>
-          <w:tblCellMar>
-            <w:top w:w="0" w:type="dxa"/>
-            <w:bottom w:w="0" w:type="dxa"/>
-          </w:tblCellMar>
-        </w:tblPrEx>
         <w:tc>
           <w:tcPr>
             <w:tcW w:w="2400" w:type="dxa"/>
@@ -992,12 +926,6 @@
         </w:tc>
       </w:tr>
       <w:tr>
-        <w:tblPrEx>
-          <w:tblCellMar>
-            <w:top w:w="0" w:type="dxa"/>
-            <w:bottom w:w="0" w:type="dxa"/>
-          </w:tblCellMar>
-        </w:tblPrEx>
         <w:tc>
           <w:tcPr>
             <w:tcW w:w="2400" w:type="dxa"/>
@@ -1078,12 +1006,6 @@
         </w:tc>
       </w:tr>
       <w:tr>
-        <w:tblPrEx>
-          <w:tblCellMar>
-            <w:top w:w="0" w:type="dxa"/>
-            <w:bottom w:w="0" w:type="dxa"/>
-          </w:tblCellMar>
-        </w:tblPrEx>
         <w:tc>
           <w:tcPr>
             <w:tcW w:w="2400" w:type="dxa"/>
@@ -1164,12 +1086,6 @@
         </w:tc>
       </w:tr>
       <w:tr>
-        <w:tblPrEx>
-          <w:tblCellMar>
-            <w:top w:w="0" w:type="dxa"/>
-            <w:bottom w:w="0" w:type="dxa"/>
-          </w:tblCellMar>
-        </w:tblPrEx>
         <w:tc>
           <w:tcPr>
             <w:tcW w:w="2400" w:type="dxa"/>
@@ -1250,12 +1166,6 @@
         </w:tc>
       </w:tr>
       <w:tr>
-        <w:tblPrEx>
-          <w:tblCellMar>
-            <w:top w:w="0" w:type="dxa"/>
-            <w:bottom w:w="0" w:type="dxa"/>
-          </w:tblCellMar>
-        </w:tblPrEx>
         <w:tc>
           <w:tcPr>
             <w:tcW w:w="2400" w:type="dxa"/>
@@ -1336,12 +1246,6 @@
         </w:tc>
       </w:tr>
       <w:tr>
-        <w:tblPrEx>
-          <w:tblCellMar>
-            <w:top w:w="0" w:type="dxa"/>
-            <w:bottom w:w="0" w:type="dxa"/>
-          </w:tblCellMar>
-        </w:tblPrEx>
         <w:tc>
           <w:tcPr>
             <w:tcW w:w="2400" w:type="dxa"/>
@@ -1422,12 +1326,6 @@
         </w:tc>
       </w:tr>
       <w:tr>
-        <w:tblPrEx>
-          <w:tblCellMar>
-            <w:top w:w="0" w:type="dxa"/>
-            <w:bottom w:w="0" w:type="dxa"/>
-          </w:tblCellMar>
-        </w:tblPrEx>
         <w:tc>
           <w:tcPr>
             <w:tcW w:w="2400" w:type="dxa"/>
@@ -1508,12 +1406,6 @@
         </w:tc>
       </w:tr>
       <w:tr>
-        <w:tblPrEx>
-          <w:tblCellMar>
-            <w:top w:w="0" w:type="dxa"/>
-            <w:bottom w:w="0" w:type="dxa"/>
-          </w:tblCellMar>
-        </w:tblPrEx>
         <w:tc>
           <w:tcPr>
             <w:tcW w:w="2400" w:type="dxa"/>
@@ -1641,12 +1533,6 @@
         <w:gridCol w:w="1443"/>
       </w:tblGrid>
       <w:tr>
-        <w:tblPrEx>
-          <w:tblCellMar>
-            <w:top w:w="0" w:type="dxa"/>
-            <w:bottom w:w="0" w:type="dxa"/>
-          </w:tblCellMar>
-        </w:tblPrEx>
         <w:tc>
           <w:tcPr>
             <w:tcW w:w="3000" w:type="dxa"/>
@@ -1736,12 +1622,6 @@
         </w:tc>
       </w:tr>
       <w:tr>
-        <w:tblPrEx>
-          <w:tblCellMar>
-            <w:top w:w="0" w:type="dxa"/>
-            <w:bottom w:w="0" w:type="dxa"/>
-          </w:tblCellMar>
-        </w:tblPrEx>
         <w:tc>
           <w:tcPr>
             <w:tcW w:w="3000" w:type="dxa"/>
@@ -1822,12 +1702,6 @@
         </w:tc>
       </w:tr>
       <w:tr>
-        <w:tblPrEx>
-          <w:tblCellMar>
-            <w:top w:w="0" w:type="dxa"/>
-            <w:bottom w:w="0" w:type="dxa"/>
-          </w:tblCellMar>
-        </w:tblPrEx>
         <w:tc>
           <w:tcPr>
             <w:tcW w:w="3000" w:type="dxa"/>
@@ -1908,12 +1782,6 @@
         </w:tc>
       </w:tr>
       <w:tr>
-        <w:tblPrEx>
-          <w:tblCellMar>
-            <w:top w:w="0" w:type="dxa"/>
-            <w:bottom w:w="0" w:type="dxa"/>
-          </w:tblCellMar>
-        </w:tblPrEx>
         <w:tc>
           <w:tcPr>
             <w:tcW w:w="3000" w:type="dxa"/>
@@ -1994,12 +1862,6 @@
         </w:tc>
       </w:tr>
       <w:tr>
-        <w:tblPrEx>
-          <w:tblCellMar>
-            <w:top w:w="0" w:type="dxa"/>
-            <w:bottom w:w="0" w:type="dxa"/>
-          </w:tblCellMar>
-        </w:tblPrEx>
         <w:tc>
           <w:tcPr>
             <w:tcW w:w="3000" w:type="dxa"/>
@@ -2080,12 +1942,6 @@
         </w:tc>
       </w:tr>
       <w:tr>
-        <w:tblPrEx>
-          <w:tblCellMar>
-            <w:top w:w="0" w:type="dxa"/>
-            <w:bottom w:w="0" w:type="dxa"/>
-          </w:tblCellMar>
-        </w:tblPrEx>
         <w:tc>
           <w:tcPr>
             <w:tcW w:w="3000" w:type="dxa"/>
@@ -2166,12 +2022,6 @@
         </w:tc>
       </w:tr>
       <w:tr>
-        <w:tblPrEx>
-          <w:tblCellMar>
-            <w:top w:w="0" w:type="dxa"/>
-            <w:bottom w:w="0" w:type="dxa"/>
-          </w:tblCellMar>
-        </w:tblPrEx>
         <w:tc>
           <w:tcPr>
             <w:tcW w:w="3000" w:type="dxa"/>
@@ -2252,12 +2102,6 @@
         </w:tc>
       </w:tr>
       <w:tr>
-        <w:tblPrEx>
-          <w:tblCellMar>
-            <w:top w:w="0" w:type="dxa"/>
-            <w:bottom w:w="0" w:type="dxa"/>
-          </w:tblCellMar>
-        </w:tblPrEx>
         <w:tc>
           <w:tcPr>
             <w:tcW w:w="3000" w:type="dxa"/>
@@ -2338,12 +2182,6 @@
         </w:tc>
       </w:tr>
       <w:tr>
-        <w:tblPrEx>
-          <w:tblCellMar>
-            <w:top w:w="0" w:type="dxa"/>
-            <w:bottom w:w="0" w:type="dxa"/>
-          </w:tblCellMar>
-        </w:tblPrEx>
         <w:tc>
           <w:tcPr>
             <w:tcW w:w="3000" w:type="dxa"/>
@@ -2424,12 +2262,6 @@
         </w:tc>
       </w:tr>
       <w:tr>
-        <w:tblPrEx>
-          <w:tblCellMar>
-            <w:top w:w="0" w:type="dxa"/>
-            <w:bottom w:w="0" w:type="dxa"/>
-          </w:tblCellMar>
-        </w:tblPrEx>
         <w:tc>
           <w:tcPr>
             <w:tcW w:w="3000" w:type="dxa"/>
@@ -2510,12 +2342,6 @@
         </w:tc>
       </w:tr>
       <w:tr>
-        <w:tblPrEx>
-          <w:tblCellMar>
-            <w:top w:w="0" w:type="dxa"/>
-            <w:bottom w:w="0" w:type="dxa"/>
-          </w:tblCellMar>
-        </w:tblPrEx>
         <w:tc>
           <w:tcPr>
             <w:tcW w:w="3000" w:type="dxa"/>
@@ -2871,12 +2697,6 @@
         <w:gridCol w:w="5460"/>
       </w:tblGrid>
       <w:tr>
-        <w:tblPrEx>
-          <w:tblCellMar>
-            <w:top w:w="0" w:type="dxa"/>
-            <w:bottom w:w="0" w:type="dxa"/>
-          </w:tblCellMar>
-        </w:tblPrEx>
         <w:tc>
           <w:tcPr>
             <w:tcW w:w="2400" w:type="dxa"/>
@@ -2966,12 +2786,6 @@
         </w:tc>
       </w:tr>
       <w:tr>
-        <w:tblPrEx>
-          <w:tblCellMar>
-            <w:top w:w="0" w:type="dxa"/>
-            <w:bottom w:w="0" w:type="dxa"/>
-          </w:tblCellMar>
-        </w:tblPrEx>
         <w:tc>
           <w:tcPr>
             <w:tcW w:w="2400" w:type="dxa"/>
@@ -3052,12 +2866,6 @@
         </w:tc>
       </w:tr>
       <w:tr>
-        <w:tblPrEx>
-          <w:tblCellMar>
-            <w:top w:w="0" w:type="dxa"/>
-            <w:bottom w:w="0" w:type="dxa"/>
-          </w:tblCellMar>
-        </w:tblPrEx>
         <w:tc>
           <w:tcPr>
             <w:tcW w:w="2400" w:type="dxa"/>
@@ -3138,12 +2946,6 @@
         </w:tc>
       </w:tr>
       <w:tr>
-        <w:tblPrEx>
-          <w:tblCellMar>
-            <w:top w:w="0" w:type="dxa"/>
-            <w:bottom w:w="0" w:type="dxa"/>
-          </w:tblCellMar>
-        </w:tblPrEx>
         <w:tc>
           <w:tcPr>
             <w:tcW w:w="2400" w:type="dxa"/>
@@ -3224,12 +3026,6 @@
         </w:tc>
       </w:tr>
       <w:tr>
-        <w:tblPrEx>
-          <w:tblCellMar>
-            <w:top w:w="0" w:type="dxa"/>
-            <w:bottom w:w="0" w:type="dxa"/>
-          </w:tblCellMar>
-        </w:tblPrEx>
         <w:tc>
           <w:tcPr>
             <w:tcW w:w="2400" w:type="dxa"/>
@@ -3310,12 +3106,6 @@
         </w:tc>
       </w:tr>
       <w:tr>
-        <w:tblPrEx>
-          <w:tblCellMar>
-            <w:top w:w="0" w:type="dxa"/>
-            <w:bottom w:w="0" w:type="dxa"/>
-          </w:tblCellMar>
-        </w:tblPrEx>
         <w:tc>
           <w:tcPr>
             <w:tcW w:w="2400" w:type="dxa"/>
@@ -3396,12 +3186,6 @@
         </w:tc>
       </w:tr>
       <w:tr>
-        <w:tblPrEx>
-          <w:tblCellMar>
-            <w:top w:w="0" w:type="dxa"/>
-            <w:bottom w:w="0" w:type="dxa"/>
-          </w:tblCellMar>
-        </w:tblPrEx>
         <w:tc>
           <w:tcPr>
             <w:tcW w:w="2400" w:type="dxa"/>
@@ -3482,12 +3266,6 @@
         </w:tc>
       </w:tr>
       <w:tr>
-        <w:tblPrEx>
-          <w:tblCellMar>
-            <w:top w:w="0" w:type="dxa"/>
-            <w:bottom w:w="0" w:type="dxa"/>
-          </w:tblCellMar>
-        </w:tblPrEx>
         <w:tc>
           <w:tcPr>
             <w:tcW w:w="2400" w:type="dxa"/>
@@ -3568,12 +3346,6 @@
         </w:tc>
       </w:tr>
       <w:tr>
-        <w:tblPrEx>
-          <w:tblCellMar>
-            <w:top w:w="0" w:type="dxa"/>
-            <w:bottom w:w="0" w:type="dxa"/>
-          </w:tblCellMar>
-        </w:tblPrEx>
         <w:tc>
           <w:tcPr>
             <w:tcW w:w="2400" w:type="dxa"/>
@@ -3654,12 +3426,6 @@
         </w:tc>
       </w:tr>
       <w:tr>
-        <w:tblPrEx>
-          <w:tblCellMar>
-            <w:top w:w="0" w:type="dxa"/>
-            <w:bottom w:w="0" w:type="dxa"/>
-          </w:tblCellMar>
-        </w:tblPrEx>
         <w:tc>
           <w:tcPr>
             <w:tcW w:w="2400" w:type="dxa"/>
@@ -3740,12 +3506,6 @@
         </w:tc>
       </w:tr>
       <w:tr>
-        <w:tblPrEx>
-          <w:tblCellMar>
-            <w:top w:w="0" w:type="dxa"/>
-            <w:bottom w:w="0" w:type="dxa"/>
-          </w:tblCellMar>
-        </w:tblPrEx>
         <w:tc>
           <w:tcPr>
             <w:tcW w:w="2400" w:type="dxa"/>
@@ -3865,12 +3625,6 @@
         <w:gridCol w:w="4360"/>
       </w:tblGrid>
       <w:tr>
-        <w:tblPrEx>
-          <w:tblCellMar>
-            <w:top w:w="0" w:type="dxa"/>
-            <w:bottom w:w="0" w:type="dxa"/>
-          </w:tblCellMar>
-        </w:tblPrEx>
         <w:tc>
           <w:tcPr>
             <w:tcW w:w="1500" w:type="dxa"/>
@@ -3960,12 +3714,6 @@
         </w:tc>
       </w:tr>
       <w:tr>
-        <w:tblPrEx>
-          <w:tblCellMar>
-            <w:top w:w="0" w:type="dxa"/>
-            <w:bottom w:w="0" w:type="dxa"/>
-          </w:tblCellMar>
-        </w:tblPrEx>
         <w:tc>
           <w:tcPr>
             <w:tcW w:w="1500" w:type="dxa"/>
@@ -4046,12 +3794,6 @@
         </w:tc>
       </w:tr>
       <w:tr>
-        <w:tblPrEx>
-          <w:tblCellMar>
-            <w:top w:w="0" w:type="dxa"/>
-            <w:bottom w:w="0" w:type="dxa"/>
-          </w:tblCellMar>
-        </w:tblPrEx>
         <w:tc>
           <w:tcPr>
             <w:tcW w:w="1500" w:type="dxa"/>
@@ -4132,12 +3874,6 @@
         </w:tc>
       </w:tr>
       <w:tr>
-        <w:tblPrEx>
-          <w:tblCellMar>
-            <w:top w:w="0" w:type="dxa"/>
-            <w:bottom w:w="0" w:type="dxa"/>
-          </w:tblCellMar>
-        </w:tblPrEx>
         <w:tc>
           <w:tcPr>
             <w:tcW w:w="1500" w:type="dxa"/>
@@ -4218,12 +3954,6 @@
         </w:tc>
       </w:tr>
       <w:tr>
-        <w:tblPrEx>
-          <w:tblCellMar>
-            <w:top w:w="0" w:type="dxa"/>
-            <w:bottom w:w="0" w:type="dxa"/>
-          </w:tblCellMar>
-        </w:tblPrEx>
         <w:tc>
           <w:tcPr>
             <w:tcW w:w="1500" w:type="dxa"/>
@@ -4304,12 +4034,6 @@
         </w:tc>
       </w:tr>
       <w:tr>
-        <w:tblPrEx>
-          <w:tblCellMar>
-            <w:top w:w="0" w:type="dxa"/>
-            <w:bottom w:w="0" w:type="dxa"/>
-          </w:tblCellMar>
-        </w:tblPrEx>
         <w:tc>
           <w:tcPr>
             <w:tcW w:w="1500" w:type="dxa"/>
@@ -4390,12 +4114,6 @@
         </w:tc>
       </w:tr>
       <w:tr>
-        <w:tblPrEx>
-          <w:tblCellMar>
-            <w:top w:w="0" w:type="dxa"/>
-            <w:bottom w:w="0" w:type="dxa"/>
-          </w:tblCellMar>
-        </w:tblPrEx>
         <w:tc>
           <w:tcPr>
             <w:tcW w:w="1500" w:type="dxa"/>
@@ -4476,12 +4194,6 @@
         </w:tc>
       </w:tr>
       <w:tr>
-        <w:tblPrEx>
-          <w:tblCellMar>
-            <w:top w:w="0" w:type="dxa"/>
-            <w:bottom w:w="0" w:type="dxa"/>
-          </w:tblCellMar>
-        </w:tblPrEx>
         <w:tc>
           <w:tcPr>
             <w:tcW w:w="1500" w:type="dxa"/>
@@ -4967,12 +4679,6 @@
         <w:gridCol w:w="4460"/>
       </w:tblGrid>
       <w:tr>
-        <w:tblPrEx>
-          <w:tblCellMar>
-            <w:top w:w="0" w:type="dxa"/>
-            <w:bottom w:w="0" w:type="dxa"/>
-          </w:tblCellMar>
-        </w:tblPrEx>
         <w:tc>
           <w:tcPr>
             <w:tcW w:w="2400" w:type="dxa"/>
@@ -5062,12 +4768,6 @@
         </w:tc>
       </w:tr>
       <w:tr>
-        <w:tblPrEx>
-          <w:tblCellMar>
-            <w:top w:w="0" w:type="dxa"/>
-            <w:bottom w:w="0" w:type="dxa"/>
-          </w:tblCellMar>
-        </w:tblPrEx>
         <w:tc>
           <w:tcPr>
             <w:tcW w:w="2400" w:type="dxa"/>
@@ -5148,12 +4848,6 @@
         </w:tc>
       </w:tr>
       <w:tr>
-        <w:tblPrEx>
-          <w:tblCellMar>
-            <w:top w:w="0" w:type="dxa"/>
-            <w:bottom w:w="0" w:type="dxa"/>
-          </w:tblCellMar>
-        </w:tblPrEx>
         <w:tc>
           <w:tcPr>
             <w:tcW w:w="2400" w:type="dxa"/>
@@ -5234,12 +4928,6 @@
         </w:tc>
       </w:tr>
       <w:tr>
-        <w:tblPrEx>
-          <w:tblCellMar>
-            <w:top w:w="0" w:type="dxa"/>
-            <w:bottom w:w="0" w:type="dxa"/>
-          </w:tblCellMar>
-        </w:tblPrEx>
         <w:tc>
           <w:tcPr>
             <w:tcW w:w="2400" w:type="dxa"/>
@@ -5320,12 +5008,6 @@
         </w:tc>
       </w:tr>
       <w:tr>
-        <w:tblPrEx>
-          <w:tblCellMar>
-            <w:top w:w="0" w:type="dxa"/>
-            <w:bottom w:w="0" w:type="dxa"/>
-          </w:tblCellMar>
-        </w:tblPrEx>
         <w:tc>
           <w:tcPr>
             <w:tcW w:w="2400" w:type="dxa"/>
@@ -5406,12 +5088,6 @@
         </w:tc>
       </w:tr>
       <w:tr>
-        <w:tblPrEx>
-          <w:tblCellMar>
-            <w:top w:w="0" w:type="dxa"/>
-            <w:bottom w:w="0" w:type="dxa"/>
-          </w:tblCellMar>
-        </w:tblPrEx>
         <w:tc>
           <w:tcPr>
             <w:tcW w:w="2400" w:type="dxa"/>
@@ -5492,12 +5168,6 @@
         </w:tc>
       </w:tr>
       <w:tr>
-        <w:tblPrEx>
-          <w:tblCellMar>
-            <w:top w:w="0" w:type="dxa"/>
-            <w:bottom w:w="0" w:type="dxa"/>
-          </w:tblCellMar>
-        </w:tblPrEx>
         <w:tc>
           <w:tcPr>
             <w:tcW w:w="2400" w:type="dxa"/>
@@ -5578,12 +5248,6 @@
         </w:tc>
       </w:tr>
       <w:tr>
-        <w:tblPrEx>
-          <w:tblCellMar>
-            <w:top w:w="0" w:type="dxa"/>
-            <w:bottom w:w="0" w:type="dxa"/>
-          </w:tblCellMar>
-        </w:tblPrEx>
         <w:tc>
           <w:tcPr>
             <w:tcW w:w="2400" w:type="dxa"/>
@@ -5741,12 +5405,6 @@
         <w:gridCol w:w="3660"/>
       </w:tblGrid>
       <w:tr>
-        <w:tblPrEx>
-          <w:tblCellMar>
-            <w:top w:w="0" w:type="dxa"/>
-            <w:bottom w:w="0" w:type="dxa"/>
-          </w:tblCellMar>
-        </w:tblPrEx>
         <w:tc>
           <w:tcPr>
             <w:tcW w:w="2200" w:type="dxa"/>
@@ -5836,12 +5494,6 @@
         </w:tc>
       </w:tr>
       <w:tr>
-        <w:tblPrEx>
-          <w:tblCellMar>
-            <w:top w:w="0" w:type="dxa"/>
-            <w:bottom w:w="0" w:type="dxa"/>
-          </w:tblCellMar>
-        </w:tblPrEx>
         <w:tc>
           <w:tcPr>
             <w:tcW w:w="2200" w:type="dxa"/>
@@ -5922,12 +5574,6 @@
         </w:tc>
       </w:tr>
       <w:tr>
-        <w:tblPrEx>
-          <w:tblCellMar>
-            <w:top w:w="0" w:type="dxa"/>
-            <w:bottom w:w="0" w:type="dxa"/>
-          </w:tblCellMar>
-        </w:tblPrEx>
         <w:tc>
           <w:tcPr>
             <w:tcW w:w="2200" w:type="dxa"/>
@@ -6008,12 +5654,6 @@
         </w:tc>
       </w:tr>
       <w:tr>
-        <w:tblPrEx>
-          <w:tblCellMar>
-            <w:top w:w="0" w:type="dxa"/>
-            <w:bottom w:w="0" w:type="dxa"/>
-          </w:tblCellMar>
-        </w:tblPrEx>
         <w:tc>
           <w:tcPr>
             <w:tcW w:w="2200" w:type="dxa"/>
@@ -6094,12 +5734,6 @@
         </w:tc>
       </w:tr>
       <w:tr>
-        <w:tblPrEx>
-          <w:tblCellMar>
-            <w:top w:w="0" w:type="dxa"/>
-            <w:bottom w:w="0" w:type="dxa"/>
-          </w:tblCellMar>
-        </w:tblPrEx>
         <w:tc>
           <w:tcPr>
             <w:tcW w:w="2200" w:type="dxa"/>
@@ -6180,12 +5814,6 @@
         </w:tc>
       </w:tr>
       <w:tr>
-        <w:tblPrEx>
-          <w:tblCellMar>
-            <w:top w:w="0" w:type="dxa"/>
-            <w:bottom w:w="0" w:type="dxa"/>
-          </w:tblCellMar>
-        </w:tblPrEx>
         <w:tc>
           <w:tcPr>
             <w:tcW w:w="2200" w:type="dxa"/>
@@ -6266,12 +5894,6 @@
         </w:tc>
       </w:tr>
       <w:tr>
-        <w:tblPrEx>
-          <w:tblCellMar>
-            <w:top w:w="0" w:type="dxa"/>
-            <w:bottom w:w="0" w:type="dxa"/>
-          </w:tblCellMar>
-        </w:tblPrEx>
         <w:tc>
           <w:tcPr>
             <w:tcW w:w="2200" w:type="dxa"/>
@@ -6352,12 +5974,6 @@
         </w:tc>
       </w:tr>
       <w:tr>
-        <w:tblPrEx>
-          <w:tblCellMar>
-            <w:top w:w="0" w:type="dxa"/>
-            <w:bottom w:w="0" w:type="dxa"/>
-          </w:tblCellMar>
-        </w:tblPrEx>
         <w:tc>
           <w:tcPr>
             <w:tcW w:w="2200" w:type="dxa"/>
@@ -6577,12 +6193,6 @@
         <w:gridCol w:w="2760"/>
       </w:tblGrid>
       <w:tr>
-        <w:tblPrEx>
-          <w:tblCellMar>
-            <w:top w:w="0" w:type="dxa"/>
-            <w:bottom w:w="0" w:type="dxa"/>
-          </w:tblCellMar>
-        </w:tblPrEx>
         <w:tc>
           <w:tcPr>
             <w:tcW w:w="3400" w:type="dxa"/>
@@ -6701,12 +6311,6 @@
         </w:tc>
       </w:tr>
       <w:tr>
-        <w:tblPrEx>
-          <w:tblCellMar>
-            <w:top w:w="0" w:type="dxa"/>
-            <w:bottom w:w="0" w:type="dxa"/>
-          </w:tblCellMar>
-        </w:tblPrEx>
         <w:tc>
           <w:tcPr>
             <w:tcW w:w="3400" w:type="dxa"/>
@@ -6813,12 +6417,6 @@
         </w:tc>
       </w:tr>
       <w:tr>
-        <w:tblPrEx>
-          <w:tblCellMar>
-            <w:top w:w="0" w:type="dxa"/>
-            <w:bottom w:w="0" w:type="dxa"/>
-          </w:tblCellMar>
-        </w:tblPrEx>
         <w:tc>
           <w:tcPr>
             <w:tcW w:w="3400" w:type="dxa"/>
@@ -6926,12 +6524,6 @@
         </w:tc>
       </w:tr>
       <w:tr>
-        <w:tblPrEx>
-          <w:tblCellMar>
-            <w:top w:w="0" w:type="dxa"/>
-            <w:bottom w:w="0" w:type="dxa"/>
-          </w:tblCellMar>
-        </w:tblPrEx>
         <w:tc>
           <w:tcPr>
             <w:tcW w:w="3400" w:type="dxa"/>
@@ -7191,2936 +6783,10 @@
       </w:r>
     </w:p>
     <w:p>
-      <w:r>
-        <w:br w:type="page"/>
-      </w:r>
-    </w:p>
-    <w:p>
       <w:pPr>
         <w:pStyle w:val="Heading1"/>
       </w:pPr>
       <w:r>
-        <w:lastRenderedPageBreak/>
-        <w:t>5. QA Test Suite</w:t>
-      </w:r>
-    </w:p>
-    <w:p>
-      <w:pPr>
-        <w:spacing w:after="120"/>
-      </w:pPr>
-      <w:r>
-        <w:t>The QA test suite is a standalone Maven module (qa-tests/) that exercises the running application from the outside through multiple independent client perspectives. It is intentionally architected as a separate module to enforce that tests interact with the application only through its public interfaces — never through internal Java APIs or shared code.</w:t>
-      </w:r>
-    </w:p>
-    <w:p>
-      <w:pPr>
-        <w:pStyle w:val="Heading2"/>
-      </w:pPr>
-      <w:r>
-        <w:t>5.1 Technology Stack</w:t>
-      </w:r>
-    </w:p>
-    <w:tbl>
-      <w:tblPr>
-        <w:tblW w:w="9360" w:type="dxa"/>
-        <w:tblBorders>
-          <w:top w:val="single" w:sz="4" w:space="0" w:color="auto"/>
-          <w:left w:val="single" w:sz="4" w:space="0" w:color="auto"/>
-          <w:bottom w:val="single" w:sz="4" w:space="0" w:color="auto"/>
-          <w:right w:val="single" w:sz="4" w:space="0" w:color="auto"/>
-          <w:insideH w:val="single" w:sz="4" w:space="0" w:color="auto"/>
-          <w:insideV w:val="single" w:sz="4" w:space="0" w:color="auto"/>
-        </w:tblBorders>
-        <w:tblCellMar>
-          <w:left w:w="10" w:type="dxa"/>
-          <w:right w:w="10" w:type="dxa"/>
-        </w:tblCellMar>
-        <w:tblLook w:val="0000" w:firstRow="0" w:lastRow="0" w:firstColumn="0" w:lastColumn="0" w:noHBand="0" w:noVBand="0"/>
-      </w:tblPr>
-      <w:tblGrid>
-        <w:gridCol w:w="2400"/>
-        <w:gridCol w:w="4000"/>
-        <w:gridCol w:w="2960"/>
-      </w:tblGrid>
-      <w:tr>
-        <w:tblPrEx>
-          <w:tblCellMar>
-            <w:top w:w="0" w:type="dxa"/>
-            <w:bottom w:w="0" w:type="dxa"/>
-          </w:tblCellMar>
-        </w:tblPrEx>
-        <w:tc>
-          <w:tcPr>
-            <w:tcW w:w="2400" w:type="dxa"/>
-            <w:tcBorders>
-              <w:top w:val="single" w:sz="4" w:space="0" w:color="CCCCCC"/>
-              <w:left w:val="single" w:sz="4" w:space="0" w:color="CCCCCC"/>
-              <w:bottom w:val="single" w:sz="4" w:space="0" w:color="CCCCCC"/>
-              <w:right w:val="single" w:sz="4" w:space="0" w:color="CCCCCC"/>
-            </w:tcBorders>
-            <w:shd w:val="clear" w:color="auto" w:fill="E8E8F0"/>
-            <w:tcMar>
-              <w:top w:w="100" w:type="dxa"/>
-              <w:left w:w="140" w:type="dxa"/>
-              <w:bottom w:w="100" w:type="dxa"/>
-              <w:right w:w="140" w:type="dxa"/>
-            </w:tcMar>
-          </w:tcPr>
-          <w:p>
-            <w:r>
-              <w:rPr>
-                <w:b/>
-                <w:bCs/>
-                <w:sz w:val="20"/>
-                <w:szCs w:val="20"/>
-              </w:rPr>
-              <w:t>Layer</w:t>
-            </w:r>
-          </w:p>
-        </w:tc>
-        <w:tc>
-          <w:tcPr>
-            <w:tcW w:w="4000" w:type="dxa"/>
-            <w:tcBorders>
-              <w:top w:val="single" w:sz="4" w:space="0" w:color="CCCCCC"/>
-              <w:left w:val="single" w:sz="4" w:space="0" w:color="CCCCCC"/>
-              <w:bottom w:val="single" w:sz="4" w:space="0" w:color="CCCCCC"/>
-              <w:right w:val="single" w:sz="4" w:space="0" w:color="CCCCCC"/>
-            </w:tcBorders>
-            <w:shd w:val="clear" w:color="auto" w:fill="E8E8F0"/>
-            <w:tcMar>
-              <w:top w:w="100" w:type="dxa"/>
-              <w:left w:w="140" w:type="dxa"/>
-              <w:bottom w:w="100" w:type="dxa"/>
-              <w:right w:w="140" w:type="dxa"/>
-            </w:tcMar>
-          </w:tcPr>
-          <w:p>
-            <w:r>
-              <w:rPr>
-                <w:b/>
-                <w:bCs/>
-                <w:sz w:val="20"/>
-                <w:szCs w:val="20"/>
-              </w:rPr>
-              <w:t>Tool</w:t>
-            </w:r>
-          </w:p>
-        </w:tc>
-        <w:tc>
-          <w:tcPr>
-            <w:tcW w:w="2960" w:type="dxa"/>
-            <w:tcBorders>
-              <w:top w:val="single" w:sz="4" w:space="0" w:color="CCCCCC"/>
-              <w:left w:val="single" w:sz="4" w:space="0" w:color="CCCCCC"/>
-              <w:bottom w:val="single" w:sz="4" w:space="0" w:color="CCCCCC"/>
-              <w:right w:val="single" w:sz="4" w:space="0" w:color="CCCCCC"/>
-            </w:tcBorders>
-            <w:shd w:val="clear" w:color="auto" w:fill="E8E8F0"/>
-            <w:tcMar>
-              <w:top w:w="100" w:type="dxa"/>
-              <w:left w:w="140" w:type="dxa"/>
-              <w:bottom w:w="100" w:type="dxa"/>
-              <w:right w:w="140" w:type="dxa"/>
-            </w:tcMar>
-          </w:tcPr>
-          <w:p>
-            <w:r>
-              <w:rPr>
-                <w:b/>
-                <w:bCs/>
-                <w:sz w:val="20"/>
-                <w:szCs w:val="20"/>
-              </w:rPr>
-              <w:t>Version</w:t>
-            </w:r>
-          </w:p>
-        </w:tc>
-      </w:tr>
-      <w:tr>
-        <w:tblPrEx>
-          <w:tblCellMar>
-            <w:top w:w="0" w:type="dxa"/>
-            <w:bottom w:w="0" w:type="dxa"/>
-          </w:tblCellMar>
-        </w:tblPrEx>
-        <w:tc>
-          <w:tcPr>
-            <w:tcW w:w="2400" w:type="dxa"/>
-            <w:tcBorders>
-              <w:top w:val="single" w:sz="4" w:space="0" w:color="CCCCCC"/>
-              <w:left w:val="single" w:sz="4" w:space="0" w:color="CCCCCC"/>
-              <w:bottom w:val="single" w:sz="4" w:space="0" w:color="CCCCCC"/>
-              <w:right w:val="single" w:sz="4" w:space="0" w:color="CCCCCC"/>
-            </w:tcBorders>
-            <w:tcMar>
-              <w:top w:w="100" w:type="dxa"/>
-              <w:left w:w="140" w:type="dxa"/>
-              <w:bottom w:w="100" w:type="dxa"/>
-              <w:right w:w="140" w:type="dxa"/>
-            </w:tcMar>
-          </w:tcPr>
-          <w:p>
-            <w:r>
-              <w:rPr>
-                <w:sz w:val="20"/>
-                <w:szCs w:val="20"/>
-              </w:rPr>
-              <w:t>Build &amp; dependencies</w:t>
-            </w:r>
-          </w:p>
-        </w:tc>
-        <w:tc>
-          <w:tcPr>
-            <w:tcW w:w="4000" w:type="dxa"/>
-            <w:tcBorders>
-              <w:top w:val="single" w:sz="4" w:space="0" w:color="CCCCCC"/>
-              <w:left w:val="single" w:sz="4" w:space="0" w:color="CCCCCC"/>
-              <w:bottom w:val="single" w:sz="4" w:space="0" w:color="CCCCCC"/>
-              <w:right w:val="single" w:sz="4" w:space="0" w:color="CCCCCC"/>
-            </w:tcBorders>
-            <w:tcMar>
-              <w:top w:w="100" w:type="dxa"/>
-              <w:left w:w="140" w:type="dxa"/>
-              <w:bottom w:w="100" w:type="dxa"/>
-              <w:right w:w="140" w:type="dxa"/>
-            </w:tcMar>
-          </w:tcPr>
-          <w:p>
-            <w:r>
-              <w:rPr>
-                <w:sz w:val="20"/>
-                <w:szCs w:val="20"/>
-              </w:rPr>
-              <w:t>Maven</w:t>
-            </w:r>
-          </w:p>
-        </w:tc>
-        <w:tc>
-          <w:tcPr>
-            <w:tcW w:w="2960" w:type="dxa"/>
-            <w:tcBorders>
-              <w:top w:val="single" w:sz="4" w:space="0" w:color="CCCCCC"/>
-              <w:left w:val="single" w:sz="4" w:space="0" w:color="CCCCCC"/>
-              <w:bottom w:val="single" w:sz="4" w:space="0" w:color="CCCCCC"/>
-              <w:right w:val="single" w:sz="4" w:space="0" w:color="CCCCCC"/>
-            </w:tcBorders>
-            <w:tcMar>
-              <w:top w:w="100" w:type="dxa"/>
-              <w:left w:w="140" w:type="dxa"/>
-              <w:bottom w:w="100" w:type="dxa"/>
-              <w:right w:w="140" w:type="dxa"/>
-            </w:tcMar>
-          </w:tcPr>
-          <w:p>
-            <w:r>
-              <w:rPr>
-                <w:sz w:val="20"/>
-                <w:szCs w:val="20"/>
-              </w:rPr>
-              <w:t>3.9+</w:t>
-            </w:r>
-          </w:p>
-        </w:tc>
-      </w:tr>
-      <w:tr>
-        <w:tblPrEx>
-          <w:tblCellMar>
-            <w:top w:w="0" w:type="dxa"/>
-            <w:bottom w:w="0" w:type="dxa"/>
-          </w:tblCellMar>
-        </w:tblPrEx>
-        <w:tc>
-          <w:tcPr>
-            <w:tcW w:w="2400" w:type="dxa"/>
-            <w:tcBorders>
-              <w:top w:val="single" w:sz="4" w:space="0" w:color="CCCCCC"/>
-              <w:left w:val="single" w:sz="4" w:space="0" w:color="CCCCCC"/>
-              <w:bottom w:val="single" w:sz="4" w:space="0" w:color="CCCCCC"/>
-              <w:right w:val="single" w:sz="4" w:space="0" w:color="CCCCCC"/>
-            </w:tcBorders>
-            <w:tcMar>
-              <w:top w:w="100" w:type="dxa"/>
-              <w:left w:w="140" w:type="dxa"/>
-              <w:bottom w:w="100" w:type="dxa"/>
-              <w:right w:w="140" w:type="dxa"/>
-            </w:tcMar>
-          </w:tcPr>
-          <w:p>
-            <w:r>
-              <w:rPr>
-                <w:sz w:val="20"/>
-                <w:szCs w:val="20"/>
-              </w:rPr>
-              <w:t>Test runner</w:t>
-            </w:r>
-          </w:p>
-        </w:tc>
-        <w:tc>
-          <w:tcPr>
-            <w:tcW w:w="4000" w:type="dxa"/>
-            <w:tcBorders>
-              <w:top w:val="single" w:sz="4" w:space="0" w:color="CCCCCC"/>
-              <w:left w:val="single" w:sz="4" w:space="0" w:color="CCCCCC"/>
-              <w:bottom w:val="single" w:sz="4" w:space="0" w:color="CCCCCC"/>
-              <w:right w:val="single" w:sz="4" w:space="0" w:color="CCCCCC"/>
-            </w:tcBorders>
-            <w:tcMar>
-              <w:top w:w="100" w:type="dxa"/>
-              <w:left w:w="140" w:type="dxa"/>
-              <w:bottom w:w="100" w:type="dxa"/>
-              <w:right w:w="140" w:type="dxa"/>
-            </w:tcMar>
-          </w:tcPr>
-          <w:p>
-            <w:r>
-              <w:rPr>
-                <w:sz w:val="20"/>
-                <w:szCs w:val="20"/>
-              </w:rPr>
-              <w:t>TestNG</w:t>
-            </w:r>
-          </w:p>
-        </w:tc>
-        <w:tc>
-          <w:tcPr>
-            <w:tcW w:w="2960" w:type="dxa"/>
-            <w:tcBorders>
-              <w:top w:val="single" w:sz="4" w:space="0" w:color="CCCCCC"/>
-              <w:left w:val="single" w:sz="4" w:space="0" w:color="CCCCCC"/>
-              <w:bottom w:val="single" w:sz="4" w:space="0" w:color="CCCCCC"/>
-              <w:right w:val="single" w:sz="4" w:space="0" w:color="CCCCCC"/>
-            </w:tcBorders>
-            <w:tcMar>
-              <w:top w:w="100" w:type="dxa"/>
-              <w:left w:w="140" w:type="dxa"/>
-              <w:bottom w:w="100" w:type="dxa"/>
-              <w:right w:w="140" w:type="dxa"/>
-            </w:tcMar>
-          </w:tcPr>
-          <w:p>
-            <w:r>
-              <w:rPr>
-                <w:sz w:val="20"/>
-                <w:szCs w:val="20"/>
-              </w:rPr>
-              <w:t>7.10.2</w:t>
-            </w:r>
-          </w:p>
-        </w:tc>
-      </w:tr>
-      <w:tr>
-        <w:tblPrEx>
-          <w:tblCellMar>
-            <w:top w:w="0" w:type="dxa"/>
-            <w:bottom w:w="0" w:type="dxa"/>
-          </w:tblCellMar>
-        </w:tblPrEx>
-        <w:tc>
-          <w:tcPr>
-            <w:tcW w:w="2400" w:type="dxa"/>
-            <w:tcBorders>
-              <w:top w:val="single" w:sz="4" w:space="0" w:color="CCCCCC"/>
-              <w:left w:val="single" w:sz="4" w:space="0" w:color="CCCCCC"/>
-              <w:bottom w:val="single" w:sz="4" w:space="0" w:color="CCCCCC"/>
-              <w:right w:val="single" w:sz="4" w:space="0" w:color="CCCCCC"/>
-            </w:tcBorders>
-            <w:tcMar>
-              <w:top w:w="100" w:type="dxa"/>
-              <w:left w:w="140" w:type="dxa"/>
-              <w:bottom w:w="100" w:type="dxa"/>
-              <w:right w:w="140" w:type="dxa"/>
-            </w:tcMar>
-          </w:tcPr>
-          <w:p>
-            <w:r>
-              <w:rPr>
-                <w:sz w:val="20"/>
-                <w:szCs w:val="20"/>
-              </w:rPr>
-              <w:t>REST testing (raw)</w:t>
-            </w:r>
-          </w:p>
-        </w:tc>
-        <w:tc>
-          <w:tcPr>
-            <w:tcW w:w="4000" w:type="dxa"/>
-            <w:tcBorders>
-              <w:top w:val="single" w:sz="4" w:space="0" w:color="CCCCCC"/>
-              <w:left w:val="single" w:sz="4" w:space="0" w:color="CCCCCC"/>
-              <w:bottom w:val="single" w:sz="4" w:space="0" w:color="CCCCCC"/>
-              <w:right w:val="single" w:sz="4" w:space="0" w:color="CCCCCC"/>
-            </w:tcBorders>
-            <w:tcMar>
-              <w:top w:w="100" w:type="dxa"/>
-              <w:left w:w="140" w:type="dxa"/>
-              <w:bottom w:w="100" w:type="dxa"/>
-              <w:right w:w="140" w:type="dxa"/>
-            </w:tcMar>
-          </w:tcPr>
-          <w:p>
-            <w:r>
-              <w:rPr>
-                <w:sz w:val="20"/>
-                <w:szCs w:val="20"/>
-              </w:rPr>
-              <w:t>Java HttpClient</w:t>
-            </w:r>
-          </w:p>
-        </w:tc>
-        <w:tc>
-          <w:tcPr>
-            <w:tcW w:w="2960" w:type="dxa"/>
-            <w:tcBorders>
-              <w:top w:val="single" w:sz="4" w:space="0" w:color="CCCCCC"/>
-              <w:left w:val="single" w:sz="4" w:space="0" w:color="CCCCCC"/>
-              <w:bottom w:val="single" w:sz="4" w:space="0" w:color="CCCCCC"/>
-              <w:right w:val="single" w:sz="4" w:space="0" w:color="CCCCCC"/>
-            </w:tcBorders>
-            <w:tcMar>
-              <w:top w:w="100" w:type="dxa"/>
-              <w:left w:w="140" w:type="dxa"/>
-              <w:bottom w:w="100" w:type="dxa"/>
-              <w:right w:w="140" w:type="dxa"/>
-            </w:tcMar>
-          </w:tcPr>
-          <w:p>
-            <w:r>
-              <w:rPr>
-                <w:sz w:val="20"/>
-                <w:szCs w:val="20"/>
-              </w:rPr>
-              <w:t>JDK 21 built-in</w:t>
-            </w:r>
-          </w:p>
-        </w:tc>
-      </w:tr>
-      <w:tr>
-        <w:tblPrEx>
-          <w:tblCellMar>
-            <w:top w:w="0" w:type="dxa"/>
-            <w:bottom w:w="0" w:type="dxa"/>
-          </w:tblCellMar>
-        </w:tblPrEx>
-        <w:tc>
-          <w:tcPr>
-            <w:tcW w:w="2400" w:type="dxa"/>
-            <w:tcBorders>
-              <w:top w:val="single" w:sz="4" w:space="0" w:color="CCCCCC"/>
-              <w:left w:val="single" w:sz="4" w:space="0" w:color="CCCCCC"/>
-              <w:bottom w:val="single" w:sz="4" w:space="0" w:color="CCCCCC"/>
-              <w:right w:val="single" w:sz="4" w:space="0" w:color="CCCCCC"/>
-            </w:tcBorders>
-            <w:tcMar>
-              <w:top w:w="100" w:type="dxa"/>
-              <w:left w:w="140" w:type="dxa"/>
-              <w:bottom w:w="100" w:type="dxa"/>
-              <w:right w:w="140" w:type="dxa"/>
-            </w:tcMar>
-          </w:tcPr>
-          <w:p>
-            <w:r>
-              <w:rPr>
-                <w:sz w:val="20"/>
-                <w:szCs w:val="20"/>
-              </w:rPr>
-              <w:t>REST testing (fluent)</w:t>
-            </w:r>
-          </w:p>
-        </w:tc>
-        <w:tc>
-          <w:tcPr>
-            <w:tcW w:w="4000" w:type="dxa"/>
-            <w:tcBorders>
-              <w:top w:val="single" w:sz="4" w:space="0" w:color="CCCCCC"/>
-              <w:left w:val="single" w:sz="4" w:space="0" w:color="CCCCCC"/>
-              <w:bottom w:val="single" w:sz="4" w:space="0" w:color="CCCCCC"/>
-              <w:right w:val="single" w:sz="4" w:space="0" w:color="CCCCCC"/>
-            </w:tcBorders>
-            <w:tcMar>
-              <w:top w:w="100" w:type="dxa"/>
-              <w:left w:w="140" w:type="dxa"/>
-              <w:bottom w:w="100" w:type="dxa"/>
-              <w:right w:w="140" w:type="dxa"/>
-            </w:tcMar>
-          </w:tcPr>
-          <w:p>
-            <w:r>
-              <w:rPr>
-                <w:sz w:val="20"/>
-                <w:szCs w:val="20"/>
-              </w:rPr>
-              <w:t>Rest Assured</w:t>
-            </w:r>
-          </w:p>
-        </w:tc>
-        <w:tc>
-          <w:tcPr>
-            <w:tcW w:w="2960" w:type="dxa"/>
-            <w:tcBorders>
-              <w:top w:val="single" w:sz="4" w:space="0" w:color="CCCCCC"/>
-              <w:left w:val="single" w:sz="4" w:space="0" w:color="CCCCCC"/>
-              <w:bottom w:val="single" w:sz="4" w:space="0" w:color="CCCCCC"/>
-              <w:right w:val="single" w:sz="4" w:space="0" w:color="CCCCCC"/>
-            </w:tcBorders>
-            <w:tcMar>
-              <w:top w:w="100" w:type="dxa"/>
-              <w:left w:w="140" w:type="dxa"/>
-              <w:bottom w:w="100" w:type="dxa"/>
-              <w:right w:w="140" w:type="dxa"/>
-            </w:tcMar>
-          </w:tcPr>
-          <w:p>
-            <w:r>
-              <w:rPr>
-                <w:sz w:val="20"/>
-                <w:szCs w:val="20"/>
-              </w:rPr>
-              <w:t>5.4.0</w:t>
-            </w:r>
-          </w:p>
-        </w:tc>
-      </w:tr>
-      <w:tr>
-        <w:tblPrEx>
-          <w:tblCellMar>
-            <w:top w:w="0" w:type="dxa"/>
-            <w:bottom w:w="0" w:type="dxa"/>
-          </w:tblCellMar>
-        </w:tblPrEx>
-        <w:tc>
-          <w:tcPr>
-            <w:tcW w:w="2400" w:type="dxa"/>
-            <w:tcBorders>
-              <w:top w:val="single" w:sz="4" w:space="0" w:color="CCCCCC"/>
-              <w:left w:val="single" w:sz="4" w:space="0" w:color="CCCCCC"/>
-              <w:bottom w:val="single" w:sz="4" w:space="0" w:color="CCCCCC"/>
-              <w:right w:val="single" w:sz="4" w:space="0" w:color="CCCCCC"/>
-            </w:tcBorders>
-            <w:tcMar>
-              <w:top w:w="100" w:type="dxa"/>
-              <w:left w:w="140" w:type="dxa"/>
-              <w:bottom w:w="100" w:type="dxa"/>
-              <w:right w:w="140" w:type="dxa"/>
-            </w:tcMar>
-          </w:tcPr>
-          <w:p>
-            <w:r>
-              <w:rPr>
-                <w:sz w:val="20"/>
-                <w:szCs w:val="20"/>
-              </w:rPr>
-              <w:t>SOAP testing</w:t>
-            </w:r>
-          </w:p>
-        </w:tc>
-        <w:tc>
-          <w:tcPr>
-            <w:tcW w:w="4000" w:type="dxa"/>
-            <w:tcBorders>
-              <w:top w:val="single" w:sz="4" w:space="0" w:color="CCCCCC"/>
-              <w:left w:val="single" w:sz="4" w:space="0" w:color="CCCCCC"/>
-              <w:bottom w:val="single" w:sz="4" w:space="0" w:color="CCCCCC"/>
-              <w:right w:val="single" w:sz="4" w:space="0" w:color="CCCCCC"/>
-            </w:tcBorders>
-            <w:tcMar>
-              <w:top w:w="100" w:type="dxa"/>
-              <w:left w:w="140" w:type="dxa"/>
-              <w:bottom w:w="100" w:type="dxa"/>
-              <w:right w:w="140" w:type="dxa"/>
-            </w:tcMar>
-          </w:tcPr>
-          <w:p>
-            <w:r>
-              <w:rPr>
-                <w:sz w:val="20"/>
-                <w:szCs w:val="20"/>
-              </w:rPr>
-              <w:t>javax.xml.transform + custom envelope</w:t>
-            </w:r>
-          </w:p>
-        </w:tc>
-        <w:tc>
-          <w:tcPr>
-            <w:tcW w:w="2960" w:type="dxa"/>
-            <w:tcBorders>
-              <w:top w:val="single" w:sz="4" w:space="0" w:color="CCCCCC"/>
-              <w:left w:val="single" w:sz="4" w:space="0" w:color="CCCCCC"/>
-              <w:bottom w:val="single" w:sz="4" w:space="0" w:color="CCCCCC"/>
-              <w:right w:val="single" w:sz="4" w:space="0" w:color="CCCCCC"/>
-            </w:tcBorders>
-            <w:tcMar>
-              <w:top w:w="100" w:type="dxa"/>
-              <w:left w:w="140" w:type="dxa"/>
-              <w:bottom w:w="100" w:type="dxa"/>
-              <w:right w:w="140" w:type="dxa"/>
-            </w:tcMar>
-          </w:tcPr>
-          <w:p>
-            <w:r>
-              <w:rPr>
-                <w:sz w:val="20"/>
-                <w:szCs w:val="20"/>
-              </w:rPr>
-              <w:t>JDK built-in</w:t>
-            </w:r>
-          </w:p>
-        </w:tc>
-      </w:tr>
-      <w:tr>
-        <w:tblPrEx>
-          <w:tblCellMar>
-            <w:top w:w="0" w:type="dxa"/>
-            <w:bottom w:w="0" w:type="dxa"/>
-          </w:tblCellMar>
-        </w:tblPrEx>
-        <w:tc>
-          <w:tcPr>
-            <w:tcW w:w="2400" w:type="dxa"/>
-            <w:tcBorders>
-              <w:top w:val="single" w:sz="4" w:space="0" w:color="CCCCCC"/>
-              <w:left w:val="single" w:sz="4" w:space="0" w:color="CCCCCC"/>
-              <w:bottom w:val="single" w:sz="4" w:space="0" w:color="CCCCCC"/>
-              <w:right w:val="single" w:sz="4" w:space="0" w:color="CCCCCC"/>
-            </w:tcBorders>
-            <w:tcMar>
-              <w:top w:w="100" w:type="dxa"/>
-              <w:left w:w="140" w:type="dxa"/>
-              <w:bottom w:w="100" w:type="dxa"/>
-              <w:right w:w="140" w:type="dxa"/>
-            </w:tcMar>
-          </w:tcPr>
-          <w:p>
-            <w:r>
-              <w:rPr>
-                <w:sz w:val="20"/>
-                <w:szCs w:val="20"/>
-              </w:rPr>
-              <w:t>UI automation</w:t>
-            </w:r>
-          </w:p>
-        </w:tc>
-        <w:tc>
-          <w:tcPr>
-            <w:tcW w:w="4000" w:type="dxa"/>
-            <w:tcBorders>
-              <w:top w:val="single" w:sz="4" w:space="0" w:color="CCCCCC"/>
-              <w:left w:val="single" w:sz="4" w:space="0" w:color="CCCCCC"/>
-              <w:bottom w:val="single" w:sz="4" w:space="0" w:color="CCCCCC"/>
-              <w:right w:val="single" w:sz="4" w:space="0" w:color="CCCCCC"/>
-            </w:tcBorders>
-            <w:tcMar>
-              <w:top w:w="100" w:type="dxa"/>
-              <w:left w:w="140" w:type="dxa"/>
-              <w:bottom w:w="100" w:type="dxa"/>
-              <w:right w:w="140" w:type="dxa"/>
-            </w:tcMar>
-          </w:tcPr>
-          <w:p>
-            <w:r>
-              <w:rPr>
-                <w:sz w:val="20"/>
-                <w:szCs w:val="20"/>
-              </w:rPr>
-              <w:t>Selenium WebDriver</w:t>
-            </w:r>
-          </w:p>
-        </w:tc>
-        <w:tc>
-          <w:tcPr>
-            <w:tcW w:w="2960" w:type="dxa"/>
-            <w:tcBorders>
-              <w:top w:val="single" w:sz="4" w:space="0" w:color="CCCCCC"/>
-              <w:left w:val="single" w:sz="4" w:space="0" w:color="CCCCCC"/>
-              <w:bottom w:val="single" w:sz="4" w:space="0" w:color="CCCCCC"/>
-              <w:right w:val="single" w:sz="4" w:space="0" w:color="CCCCCC"/>
-            </w:tcBorders>
-            <w:tcMar>
-              <w:top w:w="100" w:type="dxa"/>
-              <w:left w:w="140" w:type="dxa"/>
-              <w:bottom w:w="100" w:type="dxa"/>
-              <w:right w:w="140" w:type="dxa"/>
-            </w:tcMar>
-          </w:tcPr>
-          <w:p>
-            <w:r>
-              <w:rPr>
-                <w:sz w:val="20"/>
-                <w:szCs w:val="20"/>
-              </w:rPr>
-              <w:t>4.20.0</w:t>
-            </w:r>
-          </w:p>
-        </w:tc>
-      </w:tr>
-      <w:tr>
-        <w:tblPrEx>
-          <w:tblCellMar>
-            <w:top w:w="0" w:type="dxa"/>
-            <w:bottom w:w="0" w:type="dxa"/>
-          </w:tblCellMar>
-        </w:tblPrEx>
-        <w:tc>
-          <w:tcPr>
-            <w:tcW w:w="2400" w:type="dxa"/>
-            <w:tcBorders>
-              <w:top w:val="single" w:sz="4" w:space="0" w:color="CCCCCC"/>
-              <w:left w:val="single" w:sz="4" w:space="0" w:color="CCCCCC"/>
-              <w:bottom w:val="single" w:sz="4" w:space="0" w:color="CCCCCC"/>
-              <w:right w:val="single" w:sz="4" w:space="0" w:color="CCCCCC"/>
-            </w:tcBorders>
-            <w:tcMar>
-              <w:top w:w="100" w:type="dxa"/>
-              <w:left w:w="140" w:type="dxa"/>
-              <w:bottom w:w="100" w:type="dxa"/>
-              <w:right w:w="140" w:type="dxa"/>
-            </w:tcMar>
-          </w:tcPr>
-          <w:p>
-            <w:r>
-              <w:rPr>
-                <w:sz w:val="20"/>
-                <w:szCs w:val="20"/>
-              </w:rPr>
-              <w:t>Excel I/O</w:t>
-            </w:r>
-          </w:p>
-        </w:tc>
-        <w:tc>
-          <w:tcPr>
-            <w:tcW w:w="4000" w:type="dxa"/>
-            <w:tcBorders>
-              <w:top w:val="single" w:sz="4" w:space="0" w:color="CCCCCC"/>
-              <w:left w:val="single" w:sz="4" w:space="0" w:color="CCCCCC"/>
-              <w:bottom w:val="single" w:sz="4" w:space="0" w:color="CCCCCC"/>
-              <w:right w:val="single" w:sz="4" w:space="0" w:color="CCCCCC"/>
-            </w:tcBorders>
-            <w:tcMar>
-              <w:top w:w="100" w:type="dxa"/>
-              <w:left w:w="140" w:type="dxa"/>
-              <w:bottom w:w="100" w:type="dxa"/>
-              <w:right w:w="140" w:type="dxa"/>
-            </w:tcMar>
-          </w:tcPr>
-          <w:p>
-            <w:r>
-              <w:rPr>
-                <w:sz w:val="20"/>
-                <w:szCs w:val="20"/>
-              </w:rPr>
-              <w:t>Apache POI</w:t>
-            </w:r>
-          </w:p>
-        </w:tc>
-        <w:tc>
-          <w:tcPr>
-            <w:tcW w:w="2960" w:type="dxa"/>
-            <w:tcBorders>
-              <w:top w:val="single" w:sz="4" w:space="0" w:color="CCCCCC"/>
-              <w:left w:val="single" w:sz="4" w:space="0" w:color="CCCCCC"/>
-              <w:bottom w:val="single" w:sz="4" w:space="0" w:color="CCCCCC"/>
-              <w:right w:val="single" w:sz="4" w:space="0" w:color="CCCCCC"/>
-            </w:tcBorders>
-            <w:tcMar>
-              <w:top w:w="100" w:type="dxa"/>
-              <w:left w:w="140" w:type="dxa"/>
-              <w:bottom w:w="100" w:type="dxa"/>
-              <w:right w:w="140" w:type="dxa"/>
-            </w:tcMar>
-          </w:tcPr>
-          <w:p>
-            <w:r>
-              <w:rPr>
-                <w:sz w:val="20"/>
-                <w:szCs w:val="20"/>
-              </w:rPr>
-              <w:t>5.2.5</w:t>
-            </w:r>
-          </w:p>
-        </w:tc>
-      </w:tr>
-      <w:tr>
-        <w:tblPrEx>
-          <w:tblCellMar>
-            <w:top w:w="0" w:type="dxa"/>
-            <w:bottom w:w="0" w:type="dxa"/>
-          </w:tblCellMar>
-        </w:tblPrEx>
-        <w:tc>
-          <w:tcPr>
-            <w:tcW w:w="2400" w:type="dxa"/>
-            <w:tcBorders>
-              <w:top w:val="single" w:sz="4" w:space="0" w:color="CCCCCC"/>
-              <w:left w:val="single" w:sz="4" w:space="0" w:color="CCCCCC"/>
-              <w:bottom w:val="single" w:sz="4" w:space="0" w:color="CCCCCC"/>
-              <w:right w:val="single" w:sz="4" w:space="0" w:color="CCCCCC"/>
-            </w:tcBorders>
-            <w:tcMar>
-              <w:top w:w="100" w:type="dxa"/>
-              <w:left w:w="140" w:type="dxa"/>
-              <w:bottom w:w="100" w:type="dxa"/>
-              <w:right w:w="140" w:type="dxa"/>
-            </w:tcMar>
-          </w:tcPr>
-          <w:p>
-            <w:r>
-              <w:rPr>
-                <w:sz w:val="20"/>
-                <w:szCs w:val="20"/>
-              </w:rPr>
-              <w:t>BDD framework</w:t>
-            </w:r>
-          </w:p>
-        </w:tc>
-        <w:tc>
-          <w:tcPr>
-            <w:tcW w:w="4000" w:type="dxa"/>
-            <w:tcBorders>
-              <w:top w:val="single" w:sz="4" w:space="0" w:color="CCCCCC"/>
-              <w:left w:val="single" w:sz="4" w:space="0" w:color="CCCCCC"/>
-              <w:bottom w:val="single" w:sz="4" w:space="0" w:color="CCCCCC"/>
-              <w:right w:val="single" w:sz="4" w:space="0" w:color="CCCCCC"/>
-            </w:tcBorders>
-            <w:tcMar>
-              <w:top w:w="100" w:type="dxa"/>
-              <w:left w:w="140" w:type="dxa"/>
-              <w:bottom w:w="100" w:type="dxa"/>
-              <w:right w:w="140" w:type="dxa"/>
-            </w:tcMar>
-          </w:tcPr>
-          <w:p>
-            <w:r>
-              <w:rPr>
-                <w:sz w:val="20"/>
-                <w:szCs w:val="20"/>
-              </w:rPr>
-              <w:t>Cucumber + cucumber-testng</w:t>
-            </w:r>
-          </w:p>
-        </w:tc>
-        <w:tc>
-          <w:tcPr>
-            <w:tcW w:w="2960" w:type="dxa"/>
-            <w:tcBorders>
-              <w:top w:val="single" w:sz="4" w:space="0" w:color="CCCCCC"/>
-              <w:left w:val="single" w:sz="4" w:space="0" w:color="CCCCCC"/>
-              <w:bottom w:val="single" w:sz="4" w:space="0" w:color="CCCCCC"/>
-              <w:right w:val="single" w:sz="4" w:space="0" w:color="CCCCCC"/>
-            </w:tcBorders>
-            <w:tcMar>
-              <w:top w:w="100" w:type="dxa"/>
-              <w:left w:w="140" w:type="dxa"/>
-              <w:bottom w:w="100" w:type="dxa"/>
-              <w:right w:w="140" w:type="dxa"/>
-            </w:tcMar>
-          </w:tcPr>
-          <w:p>
-            <w:r>
-              <w:rPr>
-                <w:sz w:val="20"/>
-                <w:szCs w:val="20"/>
-              </w:rPr>
-              <w:t>7.18.0</w:t>
-            </w:r>
-          </w:p>
-        </w:tc>
-      </w:tr>
-      <w:tr>
-        <w:tblPrEx>
-          <w:tblCellMar>
-            <w:top w:w="0" w:type="dxa"/>
-            <w:bottom w:w="0" w:type="dxa"/>
-          </w:tblCellMar>
-        </w:tblPrEx>
-        <w:tc>
-          <w:tcPr>
-            <w:tcW w:w="2400" w:type="dxa"/>
-            <w:tcBorders>
-              <w:top w:val="single" w:sz="4" w:space="0" w:color="CCCCCC"/>
-              <w:left w:val="single" w:sz="4" w:space="0" w:color="CCCCCC"/>
-              <w:bottom w:val="single" w:sz="4" w:space="0" w:color="CCCCCC"/>
-              <w:right w:val="single" w:sz="4" w:space="0" w:color="CCCCCC"/>
-            </w:tcBorders>
-            <w:tcMar>
-              <w:top w:w="100" w:type="dxa"/>
-              <w:left w:w="140" w:type="dxa"/>
-              <w:bottom w:w="100" w:type="dxa"/>
-              <w:right w:w="140" w:type="dxa"/>
-            </w:tcMar>
-          </w:tcPr>
-          <w:p>
-            <w:r>
-              <w:rPr>
-                <w:sz w:val="20"/>
-                <w:szCs w:val="20"/>
-              </w:rPr>
-              <w:t>Assertion library</w:t>
-            </w:r>
-          </w:p>
-        </w:tc>
-        <w:tc>
-          <w:tcPr>
-            <w:tcW w:w="4000" w:type="dxa"/>
-            <w:tcBorders>
-              <w:top w:val="single" w:sz="4" w:space="0" w:color="CCCCCC"/>
-              <w:left w:val="single" w:sz="4" w:space="0" w:color="CCCCCC"/>
-              <w:bottom w:val="single" w:sz="4" w:space="0" w:color="CCCCCC"/>
-              <w:right w:val="single" w:sz="4" w:space="0" w:color="CCCCCC"/>
-            </w:tcBorders>
-            <w:tcMar>
-              <w:top w:w="100" w:type="dxa"/>
-              <w:left w:w="140" w:type="dxa"/>
-              <w:bottom w:w="100" w:type="dxa"/>
-              <w:right w:w="140" w:type="dxa"/>
-            </w:tcMar>
-          </w:tcPr>
-          <w:p>
-            <w:r>
-              <w:rPr>
-                <w:sz w:val="20"/>
-                <w:szCs w:val="20"/>
-              </w:rPr>
-              <w:t>TestNG Assert, Hamcrest</w:t>
-            </w:r>
-          </w:p>
-        </w:tc>
-        <w:tc>
-          <w:tcPr>
-            <w:tcW w:w="2960" w:type="dxa"/>
-            <w:tcBorders>
-              <w:top w:val="single" w:sz="4" w:space="0" w:color="CCCCCC"/>
-              <w:left w:val="single" w:sz="4" w:space="0" w:color="CCCCCC"/>
-              <w:bottom w:val="single" w:sz="4" w:space="0" w:color="CCCCCC"/>
-              <w:right w:val="single" w:sz="4" w:space="0" w:color="CCCCCC"/>
-            </w:tcBorders>
-            <w:tcMar>
-              <w:top w:w="100" w:type="dxa"/>
-              <w:left w:w="140" w:type="dxa"/>
-              <w:bottom w:w="100" w:type="dxa"/>
-              <w:right w:w="140" w:type="dxa"/>
-            </w:tcMar>
-          </w:tcPr>
-          <w:p>
-            <w:r>
-              <w:rPr>
-                <w:sz w:val="20"/>
-                <w:szCs w:val="20"/>
-              </w:rPr>
-              <w:t>—</w:t>
-            </w:r>
-          </w:p>
-        </w:tc>
-      </w:tr>
-    </w:tbl>
-    <w:p>
-      <w:pPr>
-        <w:pStyle w:val="Heading2"/>
-      </w:pPr>
-      <w:r>
-        <w:t>5.2 Test Coverage Breakdown</w:t>
-      </w:r>
-    </w:p>
-    <w:p>
-      <w:pPr>
-        <w:spacing w:after="120"/>
-      </w:pPr>
-      <w:r>
-        <w:t>The suite contains 49 distinct test executions organised into 8 categories. The TestNG groups defined in testng.xml produce the categorised report:</w:t>
-      </w:r>
-    </w:p>
-    <w:tbl>
-      <w:tblPr>
-        <w:tblW w:w="9360" w:type="dxa"/>
-        <w:tblBorders>
-          <w:top w:val="single" w:sz="4" w:space="0" w:color="auto"/>
-          <w:left w:val="single" w:sz="4" w:space="0" w:color="auto"/>
-          <w:bottom w:val="single" w:sz="4" w:space="0" w:color="auto"/>
-          <w:right w:val="single" w:sz="4" w:space="0" w:color="auto"/>
-          <w:insideH w:val="single" w:sz="4" w:space="0" w:color="auto"/>
-          <w:insideV w:val="single" w:sz="4" w:space="0" w:color="auto"/>
-        </w:tblBorders>
-        <w:tblCellMar>
-          <w:left w:w="10" w:type="dxa"/>
-          <w:right w:w="10" w:type="dxa"/>
-        </w:tblCellMar>
-        <w:tblLook w:val="0000" w:firstRow="0" w:lastRow="0" w:firstColumn="0" w:lastColumn="0" w:noHBand="0" w:noVBand="0"/>
-      </w:tblPr>
-      <w:tblGrid>
-        <w:gridCol w:w="2600"/>
-        <w:gridCol w:w="1000"/>
-        <w:gridCol w:w="5760"/>
-      </w:tblGrid>
-      <w:tr>
-        <w:tblPrEx>
-          <w:tblCellMar>
-            <w:top w:w="0" w:type="dxa"/>
-            <w:bottom w:w="0" w:type="dxa"/>
-          </w:tblCellMar>
-        </w:tblPrEx>
-        <w:tc>
-          <w:tcPr>
-            <w:tcW w:w="2600" w:type="dxa"/>
-            <w:tcBorders>
-              <w:top w:val="single" w:sz="4" w:space="0" w:color="CCCCCC"/>
-              <w:left w:val="single" w:sz="4" w:space="0" w:color="CCCCCC"/>
-              <w:bottom w:val="single" w:sz="4" w:space="0" w:color="CCCCCC"/>
-              <w:right w:val="single" w:sz="4" w:space="0" w:color="CCCCCC"/>
-            </w:tcBorders>
-            <w:shd w:val="clear" w:color="auto" w:fill="E8E8F0"/>
-            <w:tcMar>
-              <w:top w:w="100" w:type="dxa"/>
-              <w:left w:w="140" w:type="dxa"/>
-              <w:bottom w:w="100" w:type="dxa"/>
-              <w:right w:w="140" w:type="dxa"/>
-            </w:tcMar>
-          </w:tcPr>
-          <w:p>
-            <w:r>
-              <w:rPr>
-                <w:b/>
-                <w:bCs/>
-                <w:sz w:val="20"/>
-                <w:szCs w:val="20"/>
-              </w:rPr>
-              <w:t>Category</w:t>
-            </w:r>
-          </w:p>
-        </w:tc>
-        <w:tc>
-          <w:tcPr>
-            <w:tcW w:w="1000" w:type="dxa"/>
-            <w:tcBorders>
-              <w:top w:val="single" w:sz="4" w:space="0" w:color="CCCCCC"/>
-              <w:left w:val="single" w:sz="4" w:space="0" w:color="CCCCCC"/>
-              <w:bottom w:val="single" w:sz="4" w:space="0" w:color="CCCCCC"/>
-              <w:right w:val="single" w:sz="4" w:space="0" w:color="CCCCCC"/>
-            </w:tcBorders>
-            <w:shd w:val="clear" w:color="auto" w:fill="E8E8F0"/>
-            <w:tcMar>
-              <w:top w:w="100" w:type="dxa"/>
-              <w:left w:w="140" w:type="dxa"/>
-              <w:bottom w:w="100" w:type="dxa"/>
-              <w:right w:w="140" w:type="dxa"/>
-            </w:tcMar>
-          </w:tcPr>
-          <w:p>
-            <w:r>
-              <w:rPr>
-                <w:b/>
-                <w:bCs/>
-                <w:sz w:val="20"/>
-                <w:szCs w:val="20"/>
-              </w:rPr>
-              <w:t>Tests</w:t>
-            </w:r>
-          </w:p>
-        </w:tc>
-        <w:tc>
-          <w:tcPr>
-            <w:tcW w:w="5760" w:type="dxa"/>
-            <w:tcBorders>
-              <w:top w:val="single" w:sz="4" w:space="0" w:color="CCCCCC"/>
-              <w:left w:val="single" w:sz="4" w:space="0" w:color="CCCCCC"/>
-              <w:bottom w:val="single" w:sz="4" w:space="0" w:color="CCCCCC"/>
-              <w:right w:val="single" w:sz="4" w:space="0" w:color="CCCCCC"/>
-            </w:tcBorders>
-            <w:shd w:val="clear" w:color="auto" w:fill="E8E8F0"/>
-            <w:tcMar>
-              <w:top w:w="100" w:type="dxa"/>
-              <w:left w:w="140" w:type="dxa"/>
-              <w:bottom w:w="100" w:type="dxa"/>
-              <w:right w:w="140" w:type="dxa"/>
-            </w:tcMar>
-          </w:tcPr>
-          <w:p>
-            <w:r>
-              <w:rPr>
-                <w:b/>
-                <w:bCs/>
-                <w:sz w:val="20"/>
-                <w:szCs w:val="20"/>
-              </w:rPr>
-              <w:t>Technology Demonstrated</w:t>
-            </w:r>
-          </w:p>
-        </w:tc>
-      </w:tr>
-      <w:tr>
-        <w:tblPrEx>
-          <w:tblCellMar>
-            <w:top w:w="0" w:type="dxa"/>
-            <w:bottom w:w="0" w:type="dxa"/>
-          </w:tblCellMar>
-        </w:tblPrEx>
-        <w:tc>
-          <w:tcPr>
-            <w:tcW w:w="2600" w:type="dxa"/>
-            <w:tcBorders>
-              <w:top w:val="single" w:sz="4" w:space="0" w:color="CCCCCC"/>
-              <w:left w:val="single" w:sz="4" w:space="0" w:color="CCCCCC"/>
-              <w:bottom w:val="single" w:sz="4" w:space="0" w:color="CCCCCC"/>
-              <w:right w:val="single" w:sz="4" w:space="0" w:color="CCCCCC"/>
-            </w:tcBorders>
-            <w:tcMar>
-              <w:top w:w="100" w:type="dxa"/>
-              <w:left w:w="140" w:type="dxa"/>
-              <w:bottom w:w="100" w:type="dxa"/>
-              <w:right w:w="140" w:type="dxa"/>
-            </w:tcMar>
-          </w:tcPr>
-          <w:p>
-            <w:r>
-              <w:rPr>
-                <w:sz w:val="20"/>
-                <w:szCs w:val="20"/>
-              </w:rPr>
-              <w:t>REST-Auth</w:t>
-            </w:r>
-          </w:p>
-        </w:tc>
-        <w:tc>
-          <w:tcPr>
-            <w:tcW w:w="1000" w:type="dxa"/>
-            <w:tcBorders>
-              <w:top w:val="single" w:sz="4" w:space="0" w:color="CCCCCC"/>
-              <w:left w:val="single" w:sz="4" w:space="0" w:color="CCCCCC"/>
-              <w:bottom w:val="single" w:sz="4" w:space="0" w:color="CCCCCC"/>
-              <w:right w:val="single" w:sz="4" w:space="0" w:color="CCCCCC"/>
-            </w:tcBorders>
-            <w:tcMar>
-              <w:top w:w="100" w:type="dxa"/>
-              <w:left w:w="140" w:type="dxa"/>
-              <w:bottom w:w="100" w:type="dxa"/>
-              <w:right w:w="140" w:type="dxa"/>
-            </w:tcMar>
-          </w:tcPr>
-          <w:p>
-            <w:r>
-              <w:rPr>
-                <w:sz w:val="20"/>
-                <w:szCs w:val="20"/>
-              </w:rPr>
-              <w:t>7</w:t>
-            </w:r>
-          </w:p>
-        </w:tc>
-        <w:tc>
-          <w:tcPr>
-            <w:tcW w:w="5760" w:type="dxa"/>
-            <w:tcBorders>
-              <w:top w:val="single" w:sz="4" w:space="0" w:color="CCCCCC"/>
-              <w:left w:val="single" w:sz="4" w:space="0" w:color="CCCCCC"/>
-              <w:bottom w:val="single" w:sz="4" w:space="0" w:color="CCCCCC"/>
-              <w:right w:val="single" w:sz="4" w:space="0" w:color="CCCCCC"/>
-            </w:tcBorders>
-            <w:tcMar>
-              <w:top w:w="100" w:type="dxa"/>
-              <w:left w:w="140" w:type="dxa"/>
-              <w:bottom w:w="100" w:type="dxa"/>
-              <w:right w:w="140" w:type="dxa"/>
-            </w:tcMar>
-          </w:tcPr>
-          <w:p>
-            <w:r>
-              <w:rPr>
-                <w:sz w:val="20"/>
-                <w:szCs w:val="20"/>
-              </w:rPr>
-              <w:t>Java HttpClient — login, signup, /auth/me, validation</w:t>
-            </w:r>
-          </w:p>
-        </w:tc>
-      </w:tr>
-      <w:tr>
-        <w:tblPrEx>
-          <w:tblCellMar>
-            <w:top w:w="0" w:type="dxa"/>
-            <w:bottom w:w="0" w:type="dxa"/>
-          </w:tblCellMar>
-        </w:tblPrEx>
-        <w:tc>
-          <w:tcPr>
-            <w:tcW w:w="2600" w:type="dxa"/>
-            <w:tcBorders>
-              <w:top w:val="single" w:sz="4" w:space="0" w:color="CCCCCC"/>
-              <w:left w:val="single" w:sz="4" w:space="0" w:color="CCCCCC"/>
-              <w:bottom w:val="single" w:sz="4" w:space="0" w:color="CCCCCC"/>
-              <w:right w:val="single" w:sz="4" w:space="0" w:color="CCCCCC"/>
-            </w:tcBorders>
-            <w:tcMar>
-              <w:top w:w="100" w:type="dxa"/>
-              <w:left w:w="140" w:type="dxa"/>
-              <w:bottom w:w="100" w:type="dxa"/>
-              <w:right w:w="140" w:type="dxa"/>
-            </w:tcMar>
-          </w:tcPr>
-          <w:p>
-            <w:r>
-              <w:rPr>
-                <w:sz w:val="20"/>
-                <w:szCs w:val="20"/>
-              </w:rPr>
-              <w:t>REST-Tickets</w:t>
-            </w:r>
-          </w:p>
-        </w:tc>
-        <w:tc>
-          <w:tcPr>
-            <w:tcW w:w="1000" w:type="dxa"/>
-            <w:tcBorders>
-              <w:top w:val="single" w:sz="4" w:space="0" w:color="CCCCCC"/>
-              <w:left w:val="single" w:sz="4" w:space="0" w:color="CCCCCC"/>
-              <w:bottom w:val="single" w:sz="4" w:space="0" w:color="CCCCCC"/>
-              <w:right w:val="single" w:sz="4" w:space="0" w:color="CCCCCC"/>
-            </w:tcBorders>
-            <w:tcMar>
-              <w:top w:w="100" w:type="dxa"/>
-              <w:left w:w="140" w:type="dxa"/>
-              <w:bottom w:w="100" w:type="dxa"/>
-              <w:right w:w="140" w:type="dxa"/>
-            </w:tcMar>
-          </w:tcPr>
-          <w:p>
-            <w:r>
-              <w:rPr>
-                <w:sz w:val="20"/>
-                <w:szCs w:val="20"/>
-              </w:rPr>
-              <w:t>7</w:t>
-            </w:r>
-          </w:p>
-        </w:tc>
-        <w:tc>
-          <w:tcPr>
-            <w:tcW w:w="5760" w:type="dxa"/>
-            <w:tcBorders>
-              <w:top w:val="single" w:sz="4" w:space="0" w:color="CCCCCC"/>
-              <w:left w:val="single" w:sz="4" w:space="0" w:color="CCCCCC"/>
-              <w:bottom w:val="single" w:sz="4" w:space="0" w:color="CCCCCC"/>
-              <w:right w:val="single" w:sz="4" w:space="0" w:color="CCCCCC"/>
-            </w:tcBorders>
-            <w:tcMar>
-              <w:top w:w="100" w:type="dxa"/>
-              <w:left w:w="140" w:type="dxa"/>
-              <w:bottom w:w="100" w:type="dxa"/>
-              <w:right w:w="140" w:type="dxa"/>
-            </w:tcMar>
-          </w:tcPr>
-          <w:p>
-            <w:r>
-              <w:rPr>
-                <w:sz w:val="20"/>
-                <w:szCs w:val="20"/>
-              </w:rPr>
-              <w:t>Java HttpClient — ticket CRUD, authorization</w:t>
-            </w:r>
-          </w:p>
-        </w:tc>
-      </w:tr>
-      <w:tr>
-        <w:tblPrEx>
-          <w:tblCellMar>
-            <w:top w:w="0" w:type="dxa"/>
-            <w:bottom w:w="0" w:type="dxa"/>
-          </w:tblCellMar>
-        </w:tblPrEx>
-        <w:tc>
-          <w:tcPr>
-            <w:tcW w:w="2600" w:type="dxa"/>
-            <w:tcBorders>
-              <w:top w:val="single" w:sz="4" w:space="0" w:color="CCCCCC"/>
-              <w:left w:val="single" w:sz="4" w:space="0" w:color="CCCCCC"/>
-              <w:bottom w:val="single" w:sz="4" w:space="0" w:color="CCCCCC"/>
-              <w:right w:val="single" w:sz="4" w:space="0" w:color="CCCCCC"/>
-            </w:tcBorders>
-            <w:tcMar>
-              <w:top w:w="100" w:type="dxa"/>
-              <w:left w:w="140" w:type="dxa"/>
-              <w:bottom w:w="100" w:type="dxa"/>
-              <w:right w:w="140" w:type="dxa"/>
-            </w:tcMar>
-          </w:tcPr>
-          <w:p>
-            <w:r>
-              <w:rPr>
-                <w:sz w:val="20"/>
-                <w:szCs w:val="20"/>
-              </w:rPr>
-              <w:t>RestAssured-Auth</w:t>
-            </w:r>
-          </w:p>
-        </w:tc>
-        <w:tc>
-          <w:tcPr>
-            <w:tcW w:w="1000" w:type="dxa"/>
-            <w:tcBorders>
-              <w:top w:val="single" w:sz="4" w:space="0" w:color="CCCCCC"/>
-              <w:left w:val="single" w:sz="4" w:space="0" w:color="CCCCCC"/>
-              <w:bottom w:val="single" w:sz="4" w:space="0" w:color="CCCCCC"/>
-              <w:right w:val="single" w:sz="4" w:space="0" w:color="CCCCCC"/>
-            </w:tcBorders>
-            <w:tcMar>
-              <w:top w:w="100" w:type="dxa"/>
-              <w:left w:w="140" w:type="dxa"/>
-              <w:bottom w:w="100" w:type="dxa"/>
-              <w:right w:w="140" w:type="dxa"/>
-            </w:tcMar>
-          </w:tcPr>
-          <w:p>
-            <w:r>
-              <w:rPr>
-                <w:sz w:val="20"/>
-                <w:szCs w:val="20"/>
-              </w:rPr>
-              <w:t>4</w:t>
-            </w:r>
-          </w:p>
-        </w:tc>
-        <w:tc>
-          <w:tcPr>
-            <w:tcW w:w="5760" w:type="dxa"/>
-            <w:tcBorders>
-              <w:top w:val="single" w:sz="4" w:space="0" w:color="CCCCCC"/>
-              <w:left w:val="single" w:sz="4" w:space="0" w:color="CCCCCC"/>
-              <w:bottom w:val="single" w:sz="4" w:space="0" w:color="CCCCCC"/>
-              <w:right w:val="single" w:sz="4" w:space="0" w:color="CCCCCC"/>
-            </w:tcBorders>
-            <w:tcMar>
-              <w:top w:w="100" w:type="dxa"/>
-              <w:left w:w="140" w:type="dxa"/>
-              <w:bottom w:w="100" w:type="dxa"/>
-              <w:right w:w="140" w:type="dxa"/>
-            </w:tcMar>
-          </w:tcPr>
-          <w:p>
-            <w:r>
-              <w:rPr>
-                <w:sz w:val="20"/>
-                <w:szCs w:val="20"/>
-              </w:rPr>
-              <w:t>Rest Assured DSL — auth scenarios</w:t>
-            </w:r>
-          </w:p>
-        </w:tc>
-      </w:tr>
-      <w:tr>
-        <w:tblPrEx>
-          <w:tblCellMar>
-            <w:top w:w="0" w:type="dxa"/>
-            <w:bottom w:w="0" w:type="dxa"/>
-          </w:tblCellMar>
-        </w:tblPrEx>
-        <w:tc>
-          <w:tcPr>
-            <w:tcW w:w="2600" w:type="dxa"/>
-            <w:tcBorders>
-              <w:top w:val="single" w:sz="4" w:space="0" w:color="CCCCCC"/>
-              <w:left w:val="single" w:sz="4" w:space="0" w:color="CCCCCC"/>
-              <w:bottom w:val="single" w:sz="4" w:space="0" w:color="CCCCCC"/>
-              <w:right w:val="single" w:sz="4" w:space="0" w:color="CCCCCC"/>
-            </w:tcBorders>
-            <w:tcMar>
-              <w:top w:w="100" w:type="dxa"/>
-              <w:left w:w="140" w:type="dxa"/>
-              <w:bottom w:w="100" w:type="dxa"/>
-              <w:right w:w="140" w:type="dxa"/>
-            </w:tcMar>
-          </w:tcPr>
-          <w:p>
-            <w:r>
-              <w:rPr>
-                <w:sz w:val="20"/>
-                <w:szCs w:val="20"/>
-              </w:rPr>
-              <w:t>RestAssured-Tickets</w:t>
-            </w:r>
-          </w:p>
-        </w:tc>
-        <w:tc>
-          <w:tcPr>
-            <w:tcW w:w="1000" w:type="dxa"/>
-            <w:tcBorders>
-              <w:top w:val="single" w:sz="4" w:space="0" w:color="CCCCCC"/>
-              <w:left w:val="single" w:sz="4" w:space="0" w:color="CCCCCC"/>
-              <w:bottom w:val="single" w:sz="4" w:space="0" w:color="CCCCCC"/>
-              <w:right w:val="single" w:sz="4" w:space="0" w:color="CCCCCC"/>
-            </w:tcBorders>
-            <w:tcMar>
-              <w:top w:w="100" w:type="dxa"/>
-              <w:left w:w="140" w:type="dxa"/>
-              <w:bottom w:w="100" w:type="dxa"/>
-              <w:right w:w="140" w:type="dxa"/>
-            </w:tcMar>
-          </w:tcPr>
-          <w:p>
-            <w:r>
-              <w:rPr>
-                <w:sz w:val="20"/>
-                <w:szCs w:val="20"/>
-              </w:rPr>
-              <w:t>5</w:t>
-            </w:r>
-          </w:p>
-        </w:tc>
-        <w:tc>
-          <w:tcPr>
-            <w:tcW w:w="5760" w:type="dxa"/>
-            <w:tcBorders>
-              <w:top w:val="single" w:sz="4" w:space="0" w:color="CCCCCC"/>
-              <w:left w:val="single" w:sz="4" w:space="0" w:color="CCCCCC"/>
-              <w:bottom w:val="single" w:sz="4" w:space="0" w:color="CCCCCC"/>
-              <w:right w:val="single" w:sz="4" w:space="0" w:color="CCCCCC"/>
-            </w:tcBorders>
-            <w:tcMar>
-              <w:top w:w="100" w:type="dxa"/>
-              <w:left w:w="140" w:type="dxa"/>
-              <w:bottom w:w="100" w:type="dxa"/>
-              <w:right w:w="140" w:type="dxa"/>
-            </w:tcMar>
-          </w:tcPr>
-          <w:p>
-            <w:r>
-              <w:rPr>
-                <w:sz w:val="20"/>
-                <w:szCs w:val="20"/>
-              </w:rPr>
-              <w:t>Rest Assured DSL — ticket scenarios</w:t>
-            </w:r>
-          </w:p>
-        </w:tc>
-      </w:tr>
-      <w:tr>
-        <w:tblPrEx>
-          <w:tblCellMar>
-            <w:top w:w="0" w:type="dxa"/>
-            <w:bottom w:w="0" w:type="dxa"/>
-          </w:tblCellMar>
-        </w:tblPrEx>
-        <w:tc>
-          <w:tcPr>
-            <w:tcW w:w="2600" w:type="dxa"/>
-            <w:tcBorders>
-              <w:top w:val="single" w:sz="4" w:space="0" w:color="CCCCCC"/>
-              <w:left w:val="single" w:sz="4" w:space="0" w:color="CCCCCC"/>
-              <w:bottom w:val="single" w:sz="4" w:space="0" w:color="CCCCCC"/>
-              <w:right w:val="single" w:sz="4" w:space="0" w:color="CCCCCC"/>
-            </w:tcBorders>
-            <w:tcMar>
-              <w:top w:w="100" w:type="dxa"/>
-              <w:left w:w="140" w:type="dxa"/>
-              <w:bottom w:w="100" w:type="dxa"/>
-              <w:right w:w="140" w:type="dxa"/>
-            </w:tcMar>
-          </w:tcPr>
-          <w:p>
-            <w:r>
-              <w:rPr>
-                <w:sz w:val="20"/>
-                <w:szCs w:val="20"/>
-              </w:rPr>
-              <w:t>SOAP-Stats</w:t>
-            </w:r>
-          </w:p>
-        </w:tc>
-        <w:tc>
-          <w:tcPr>
-            <w:tcW w:w="1000" w:type="dxa"/>
-            <w:tcBorders>
-              <w:top w:val="single" w:sz="4" w:space="0" w:color="CCCCCC"/>
-              <w:left w:val="single" w:sz="4" w:space="0" w:color="CCCCCC"/>
-              <w:bottom w:val="single" w:sz="4" w:space="0" w:color="CCCCCC"/>
-              <w:right w:val="single" w:sz="4" w:space="0" w:color="CCCCCC"/>
-            </w:tcBorders>
-            <w:tcMar>
-              <w:top w:w="100" w:type="dxa"/>
-              <w:left w:w="140" w:type="dxa"/>
-              <w:bottom w:w="100" w:type="dxa"/>
-              <w:right w:w="140" w:type="dxa"/>
-            </w:tcMar>
-          </w:tcPr>
-          <w:p>
-            <w:r>
-              <w:rPr>
-                <w:sz w:val="20"/>
-                <w:szCs w:val="20"/>
-              </w:rPr>
-              <w:t>5</w:t>
-            </w:r>
-          </w:p>
-        </w:tc>
-        <w:tc>
-          <w:tcPr>
-            <w:tcW w:w="5760" w:type="dxa"/>
-            <w:tcBorders>
-              <w:top w:val="single" w:sz="4" w:space="0" w:color="CCCCCC"/>
-              <w:left w:val="single" w:sz="4" w:space="0" w:color="CCCCCC"/>
-              <w:bottom w:val="single" w:sz="4" w:space="0" w:color="CCCCCC"/>
-              <w:right w:val="single" w:sz="4" w:space="0" w:color="CCCCCC"/>
-            </w:tcBorders>
-            <w:tcMar>
-              <w:top w:w="100" w:type="dxa"/>
-              <w:left w:w="140" w:type="dxa"/>
-              <w:bottom w:w="100" w:type="dxa"/>
-              <w:right w:w="140" w:type="dxa"/>
-            </w:tcMar>
-          </w:tcPr>
-          <w:p>
-            <w:r>
-              <w:rPr>
-                <w:sz w:val="20"/>
-                <w:szCs w:val="20"/>
-              </w:rPr>
-              <w:t>Raw SOAP envelope + WSDL validation</w:t>
-            </w:r>
-          </w:p>
-        </w:tc>
-      </w:tr>
-      <w:tr>
-        <w:tblPrEx>
-          <w:tblCellMar>
-            <w:top w:w="0" w:type="dxa"/>
-            <w:bottom w:w="0" w:type="dxa"/>
-          </w:tblCellMar>
-        </w:tblPrEx>
-        <w:tc>
-          <w:tcPr>
-            <w:tcW w:w="2600" w:type="dxa"/>
-            <w:tcBorders>
-              <w:top w:val="single" w:sz="4" w:space="0" w:color="CCCCCC"/>
-              <w:left w:val="single" w:sz="4" w:space="0" w:color="CCCCCC"/>
-              <w:bottom w:val="single" w:sz="4" w:space="0" w:color="CCCCCC"/>
-              <w:right w:val="single" w:sz="4" w:space="0" w:color="CCCCCC"/>
-            </w:tcBorders>
-            <w:tcMar>
-              <w:top w:w="100" w:type="dxa"/>
-              <w:left w:w="140" w:type="dxa"/>
-              <w:bottom w:w="100" w:type="dxa"/>
-              <w:right w:w="140" w:type="dxa"/>
-            </w:tcMar>
-          </w:tcPr>
-          <w:p>
-            <w:r>
-              <w:rPr>
-                <w:sz w:val="20"/>
-                <w:szCs w:val="20"/>
-              </w:rPr>
-              <w:t>UI-Login</w:t>
-            </w:r>
-          </w:p>
-        </w:tc>
-        <w:tc>
-          <w:tcPr>
-            <w:tcW w:w="1000" w:type="dxa"/>
-            <w:tcBorders>
-              <w:top w:val="single" w:sz="4" w:space="0" w:color="CCCCCC"/>
-              <w:left w:val="single" w:sz="4" w:space="0" w:color="CCCCCC"/>
-              <w:bottom w:val="single" w:sz="4" w:space="0" w:color="CCCCCC"/>
-              <w:right w:val="single" w:sz="4" w:space="0" w:color="CCCCCC"/>
-            </w:tcBorders>
-            <w:tcMar>
-              <w:top w:w="100" w:type="dxa"/>
-              <w:left w:w="140" w:type="dxa"/>
-              <w:bottom w:w="100" w:type="dxa"/>
-              <w:right w:w="140" w:type="dxa"/>
-            </w:tcMar>
-          </w:tcPr>
-          <w:p>
-            <w:r>
-              <w:rPr>
-                <w:sz w:val="20"/>
-                <w:szCs w:val="20"/>
-              </w:rPr>
-              <w:t>5</w:t>
-            </w:r>
-          </w:p>
-        </w:tc>
-        <w:tc>
-          <w:tcPr>
-            <w:tcW w:w="5760" w:type="dxa"/>
-            <w:tcBorders>
-              <w:top w:val="single" w:sz="4" w:space="0" w:color="CCCCCC"/>
-              <w:left w:val="single" w:sz="4" w:space="0" w:color="CCCCCC"/>
-              <w:bottom w:val="single" w:sz="4" w:space="0" w:color="CCCCCC"/>
-              <w:right w:val="single" w:sz="4" w:space="0" w:color="CCCCCC"/>
-            </w:tcBorders>
-            <w:tcMar>
-              <w:top w:w="100" w:type="dxa"/>
-              <w:left w:w="140" w:type="dxa"/>
-              <w:bottom w:w="100" w:type="dxa"/>
-              <w:right w:w="140" w:type="dxa"/>
-            </w:tcMar>
-          </w:tcPr>
-          <w:p>
-            <w:r>
-              <w:rPr>
-                <w:sz w:val="20"/>
-                <w:szCs w:val="20"/>
-              </w:rPr>
-              <w:t>Selenium + Page Object Model — login flows</w:t>
-            </w:r>
-          </w:p>
-        </w:tc>
-      </w:tr>
-      <w:tr>
-        <w:tblPrEx>
-          <w:tblCellMar>
-            <w:top w:w="0" w:type="dxa"/>
-            <w:bottom w:w="0" w:type="dxa"/>
-          </w:tblCellMar>
-        </w:tblPrEx>
-        <w:tc>
-          <w:tcPr>
-            <w:tcW w:w="2600" w:type="dxa"/>
-            <w:tcBorders>
-              <w:top w:val="single" w:sz="4" w:space="0" w:color="CCCCCC"/>
-              <w:left w:val="single" w:sz="4" w:space="0" w:color="CCCCCC"/>
-              <w:bottom w:val="single" w:sz="4" w:space="0" w:color="CCCCCC"/>
-              <w:right w:val="single" w:sz="4" w:space="0" w:color="CCCCCC"/>
-            </w:tcBorders>
-            <w:tcMar>
-              <w:top w:w="100" w:type="dxa"/>
-              <w:left w:w="140" w:type="dxa"/>
-              <w:bottom w:w="100" w:type="dxa"/>
-              <w:right w:w="140" w:type="dxa"/>
-            </w:tcMar>
-          </w:tcPr>
-          <w:p>
-            <w:r>
-              <w:rPr>
-                <w:sz w:val="20"/>
-                <w:szCs w:val="20"/>
-              </w:rPr>
-              <w:t>UI-TicketCreation</w:t>
-            </w:r>
-          </w:p>
-        </w:tc>
-        <w:tc>
-          <w:tcPr>
-            <w:tcW w:w="1000" w:type="dxa"/>
-            <w:tcBorders>
-              <w:top w:val="single" w:sz="4" w:space="0" w:color="CCCCCC"/>
-              <w:left w:val="single" w:sz="4" w:space="0" w:color="CCCCCC"/>
-              <w:bottom w:val="single" w:sz="4" w:space="0" w:color="CCCCCC"/>
-              <w:right w:val="single" w:sz="4" w:space="0" w:color="CCCCCC"/>
-            </w:tcBorders>
-            <w:tcMar>
-              <w:top w:w="100" w:type="dxa"/>
-              <w:left w:w="140" w:type="dxa"/>
-              <w:bottom w:w="100" w:type="dxa"/>
-              <w:right w:w="140" w:type="dxa"/>
-            </w:tcMar>
-          </w:tcPr>
-          <w:p>
-            <w:r>
-              <w:rPr>
-                <w:sz w:val="20"/>
-                <w:szCs w:val="20"/>
-              </w:rPr>
-              <w:t>6</w:t>
-            </w:r>
-          </w:p>
-        </w:tc>
-        <w:tc>
-          <w:tcPr>
-            <w:tcW w:w="5760" w:type="dxa"/>
-            <w:tcBorders>
-              <w:top w:val="single" w:sz="4" w:space="0" w:color="CCCCCC"/>
-              <w:left w:val="single" w:sz="4" w:space="0" w:color="CCCCCC"/>
-              <w:bottom w:val="single" w:sz="4" w:space="0" w:color="CCCCCC"/>
-              <w:right w:val="single" w:sz="4" w:space="0" w:color="CCCCCC"/>
-            </w:tcBorders>
-            <w:tcMar>
-              <w:top w:w="100" w:type="dxa"/>
-              <w:left w:w="140" w:type="dxa"/>
-              <w:bottom w:w="100" w:type="dxa"/>
-              <w:right w:w="140" w:type="dxa"/>
-            </w:tcMar>
-          </w:tcPr>
-          <w:p>
-            <w:r>
-              <w:rPr>
-                <w:sz w:val="20"/>
-                <w:szCs w:val="20"/>
-              </w:rPr>
-              <w:t>Selenium + POM — dynamic Angular form</w:t>
-            </w:r>
-          </w:p>
-        </w:tc>
-      </w:tr>
-      <w:tr>
-        <w:tblPrEx>
-          <w:tblCellMar>
-            <w:top w:w="0" w:type="dxa"/>
-            <w:bottom w:w="0" w:type="dxa"/>
-          </w:tblCellMar>
-        </w:tblPrEx>
-        <w:tc>
-          <w:tcPr>
-            <w:tcW w:w="2600" w:type="dxa"/>
-            <w:tcBorders>
-              <w:top w:val="single" w:sz="4" w:space="0" w:color="CCCCCC"/>
-              <w:left w:val="single" w:sz="4" w:space="0" w:color="CCCCCC"/>
-              <w:bottom w:val="single" w:sz="4" w:space="0" w:color="CCCCCC"/>
-              <w:right w:val="single" w:sz="4" w:space="0" w:color="CCCCCC"/>
-            </w:tcBorders>
-            <w:tcMar>
-              <w:top w:w="100" w:type="dxa"/>
-              <w:left w:w="140" w:type="dxa"/>
-              <w:bottom w:w="100" w:type="dxa"/>
-              <w:right w:w="140" w:type="dxa"/>
-            </w:tcMar>
-          </w:tcPr>
-          <w:p>
-            <w:r>
-              <w:rPr>
-                <w:sz w:val="20"/>
-                <w:szCs w:val="20"/>
-              </w:rPr>
-              <w:t>BDD</w:t>
-            </w:r>
-          </w:p>
-        </w:tc>
-        <w:tc>
-          <w:tcPr>
-            <w:tcW w:w="1000" w:type="dxa"/>
-            <w:tcBorders>
-              <w:top w:val="single" w:sz="4" w:space="0" w:color="CCCCCC"/>
-              <w:left w:val="single" w:sz="4" w:space="0" w:color="CCCCCC"/>
-              <w:bottom w:val="single" w:sz="4" w:space="0" w:color="CCCCCC"/>
-              <w:right w:val="single" w:sz="4" w:space="0" w:color="CCCCCC"/>
-            </w:tcBorders>
-            <w:tcMar>
-              <w:top w:w="100" w:type="dxa"/>
-              <w:left w:w="140" w:type="dxa"/>
-              <w:bottom w:w="100" w:type="dxa"/>
-              <w:right w:w="140" w:type="dxa"/>
-            </w:tcMar>
-          </w:tcPr>
-          <w:p>
-            <w:r>
-              <w:rPr>
-                <w:sz w:val="20"/>
-                <w:szCs w:val="20"/>
-              </w:rPr>
-              <w:t>10</w:t>
-            </w:r>
-          </w:p>
-        </w:tc>
-        <w:tc>
-          <w:tcPr>
-            <w:tcW w:w="5760" w:type="dxa"/>
-            <w:tcBorders>
-              <w:top w:val="single" w:sz="4" w:space="0" w:color="CCCCCC"/>
-              <w:left w:val="single" w:sz="4" w:space="0" w:color="CCCCCC"/>
-              <w:bottom w:val="single" w:sz="4" w:space="0" w:color="CCCCCC"/>
-              <w:right w:val="single" w:sz="4" w:space="0" w:color="CCCCCC"/>
-            </w:tcBorders>
-            <w:tcMar>
-              <w:top w:w="100" w:type="dxa"/>
-              <w:left w:w="140" w:type="dxa"/>
-              <w:bottom w:w="100" w:type="dxa"/>
-              <w:right w:w="140" w:type="dxa"/>
-            </w:tcMar>
-          </w:tcPr>
-          <w:p>
-            <w:r>
-              <w:rPr>
-                <w:sz w:val="20"/>
-                <w:szCs w:val="20"/>
-              </w:rPr>
-              <w:t>Cucumber Gherkin scenarios + step definitions</w:t>
-            </w:r>
-          </w:p>
-        </w:tc>
-      </w:tr>
-      <w:tr>
-        <w:tblPrEx>
-          <w:tblCellMar>
-            <w:top w:w="0" w:type="dxa"/>
-            <w:bottom w:w="0" w:type="dxa"/>
-          </w:tblCellMar>
-        </w:tblPrEx>
-        <w:tc>
-          <w:tcPr>
-            <w:tcW w:w="2600" w:type="dxa"/>
-            <w:tcBorders>
-              <w:top w:val="single" w:sz="4" w:space="0" w:color="CCCCCC"/>
-              <w:left w:val="single" w:sz="4" w:space="0" w:color="CCCCCC"/>
-              <w:bottom w:val="single" w:sz="4" w:space="0" w:color="CCCCCC"/>
-              <w:right w:val="single" w:sz="4" w:space="0" w:color="CCCCCC"/>
-            </w:tcBorders>
-            <w:tcMar>
-              <w:top w:w="100" w:type="dxa"/>
-              <w:left w:w="140" w:type="dxa"/>
-              <w:bottom w:w="100" w:type="dxa"/>
-              <w:right w:w="140" w:type="dxa"/>
-            </w:tcMar>
-          </w:tcPr>
-          <w:p>
-            <w:r>
-              <w:rPr>
-                <w:sz w:val="20"/>
-                <w:szCs w:val="20"/>
-              </w:rPr>
-              <w:t>TOTAL</w:t>
-            </w:r>
-          </w:p>
-        </w:tc>
-        <w:tc>
-          <w:tcPr>
-            <w:tcW w:w="1000" w:type="dxa"/>
-            <w:tcBorders>
-              <w:top w:val="single" w:sz="4" w:space="0" w:color="CCCCCC"/>
-              <w:left w:val="single" w:sz="4" w:space="0" w:color="CCCCCC"/>
-              <w:bottom w:val="single" w:sz="4" w:space="0" w:color="CCCCCC"/>
-              <w:right w:val="single" w:sz="4" w:space="0" w:color="CCCCCC"/>
-            </w:tcBorders>
-            <w:tcMar>
-              <w:top w:w="100" w:type="dxa"/>
-              <w:left w:w="140" w:type="dxa"/>
-              <w:bottom w:w="100" w:type="dxa"/>
-              <w:right w:w="140" w:type="dxa"/>
-            </w:tcMar>
-          </w:tcPr>
-          <w:p>
-            <w:r>
-              <w:rPr>
-                <w:sz w:val="20"/>
-                <w:szCs w:val="20"/>
-              </w:rPr>
-              <w:t>49</w:t>
-            </w:r>
-          </w:p>
-        </w:tc>
-        <w:tc>
-          <w:tcPr>
-            <w:tcW w:w="5760" w:type="dxa"/>
-            <w:tcBorders>
-              <w:top w:val="single" w:sz="4" w:space="0" w:color="CCCCCC"/>
-              <w:left w:val="single" w:sz="4" w:space="0" w:color="CCCCCC"/>
-              <w:bottom w:val="single" w:sz="4" w:space="0" w:color="CCCCCC"/>
-              <w:right w:val="single" w:sz="4" w:space="0" w:color="CCCCCC"/>
-            </w:tcBorders>
-            <w:tcMar>
-              <w:top w:w="100" w:type="dxa"/>
-              <w:left w:w="140" w:type="dxa"/>
-              <w:bottom w:w="100" w:type="dxa"/>
-              <w:right w:w="140" w:type="dxa"/>
-            </w:tcMar>
-          </w:tcPr>
-          <w:p>
-            <w:r>
-              <w:rPr>
-                <w:sz w:val="20"/>
-                <w:szCs w:val="20"/>
-              </w:rPr>
-              <w:t>Six independent testing technologies</w:t>
-            </w:r>
-          </w:p>
-        </w:tc>
-      </w:tr>
-    </w:tbl>
-    <w:p>
-      <w:pPr>
-        <w:pStyle w:val="Heading2"/>
-      </w:pPr>
-      <w:r>
-        <w:t>5.3 Architectural Patterns</w:t>
-      </w:r>
-    </w:p>
-    <w:p>
-      <w:pPr>
-        <w:pStyle w:val="Heading3"/>
-      </w:pPr>
-      <w:r>
-        <w:lastRenderedPageBreak/>
-        <w:t>Page Object Model (POM)</w:t>
-      </w:r>
-    </w:p>
-    <w:p>
-      <w:pPr>
-        <w:spacing w:after="120"/>
-      </w:pPr>
-      <w:r>
-        <w:t>UI tests use the Page Object Model design pattern. Each application screen is represented by a Java class encapsulating its locators and exposing high-level methods. Tests then read as user actions rather than browser commands:</w:t>
-      </w:r>
-    </w:p>
-    <w:p>
-      <w:pPr>
-        <w:pStyle w:val="ListParagraph"/>
-        <w:numPr>
-          <w:ilvl w:val="0"/>
-          <w:numId w:val="2"/>
-        </w:numPr>
-        <w:spacing w:after="80"/>
-      </w:pPr>
-      <w:r>
-        <w:t>LoginPage — exposes open(), enterEmail(), enterPassword(), clickLogin(), expectError()</w:t>
-      </w:r>
-    </w:p>
-    <w:p>
-      <w:pPr>
-        <w:pStyle w:val="ListParagraph"/>
-        <w:numPr>
-          <w:ilvl w:val="0"/>
-          <w:numId w:val="2"/>
-        </w:numPr>
-        <w:spacing w:after="80"/>
-      </w:pPr>
-      <w:r>
-        <w:t>CreateTicketPage — exposes selectCategory(), enterTitle(), enterDescription(), submit()</w:t>
-      </w:r>
-    </w:p>
-    <w:p>
-      <w:pPr>
-        <w:pStyle w:val="ListParagraph"/>
-        <w:numPr>
-          <w:ilvl w:val="0"/>
-          <w:numId w:val="2"/>
-        </w:numPr>
-        <w:spacing w:after="80"/>
-      </w:pPr>
-      <w:r>
-        <w:t>DashboardPage and TicketDetailPage — provide read-side methods for assertions</w:t>
-      </w:r>
-    </w:p>
-    <w:p>
-      <w:pPr>
-        <w:spacing w:after="120"/>
-      </w:pPr>
-      <w:r>
-        <w:t>This pattern eliminates duplication of locators across tests and isolates UI changes to a single point of update.</w:t>
-      </w:r>
-    </w:p>
-    <w:p>
-      <w:pPr>
-        <w:pStyle w:val="Heading3"/>
-      </w:pPr>
-      <w:r>
-        <w:t>Data-Driven Testing with Apache POI</w:t>
-      </w:r>
-    </w:p>
-    <w:p>
-      <w:pPr>
-        <w:spacing w:after="120"/>
-      </w:pPr>
-      <w:r>
-        <w:t>Test inputs are externalised to Excel files in src/test/resources/testdata/. The ExcelReader utility loads sheets as Object[][] arrays for TestNG @DataProvider methods, allowing test scenarios to be edited without recompilation. The ResultRecorder utility writes the final pass/fail outcomes back to a timestamped Excel report with colour-coded rows.</w:t>
-      </w:r>
-    </w:p>
-    <w:p>
-      <w:pPr>
-        <w:pStyle w:val="Heading3"/>
-      </w:pPr>
-      <w:r>
-        <w:t>BDD Layer with Cucumber</w:t>
-      </w:r>
-    </w:p>
-    <w:p>
-      <w:pPr>
-        <w:spacing w:after="120"/>
-      </w:pPr>
-      <w:r>
-        <w:t>Cucumber scenarios provide a business-readable layer on top of the existing test infrastructure. Feature files describe behaviour in Gherkin syntax (Given/When/Then), and step definitions map each phrase to a Java method that drives the underlying Selenium or HttpClient calls. The CucumberTestRunner extends AbstractTestNGCucumberTests, integrating Cucumber's execution lifecycle into the TestNG suite.</w:t>
-      </w:r>
-    </w:p>
-    <w:p>
-      <w:pPr>
-        <w:pStyle w:val="Heading2"/>
-      </w:pPr>
-      <w:r>
-        <w:t>5.4 TestNG Integration</w:t>
-      </w:r>
-    </w:p>
-    <w:p>
-      <w:pPr>
-        <w:spacing w:after="120"/>
-      </w:pPr>
-      <w:r>
-        <w:t>TestNG orchestrates the entire suite via testng.xml, which declares the 5 test groups (REST, RestAssured, SOAP, UI-Selenium, Cucumber-BDD) and registers the SuiteListener. The listener hooks into onFinish() to write the consolidated Excel report. Key TestNG features used:</w:t>
-      </w:r>
-    </w:p>
-    <w:p>
-      <w:pPr>
-        <w:pStyle w:val="ListParagraph"/>
-        <w:numPr>
-          <w:ilvl w:val="0"/>
-          <w:numId w:val="2"/>
-        </w:numPr>
-        <w:spacing w:after="80"/>
-      </w:pPr>
-      <w:r>
-        <w:t>@Test — marks executable test methods</w:t>
-      </w:r>
-    </w:p>
-    <w:p>
-      <w:pPr>
-        <w:pStyle w:val="ListParagraph"/>
-        <w:numPr>
-          <w:ilvl w:val="0"/>
-          <w:numId w:val="2"/>
-        </w:numPr>
-        <w:spacing w:after="80"/>
-      </w:pPr>
-      <w:r>
-        <w:t>@DataProvider — supplies parameterised inputs from Excel</w:t>
-      </w:r>
-    </w:p>
-    <w:p>
-      <w:pPr>
-        <w:pStyle w:val="ListParagraph"/>
-        <w:numPr>
-          <w:ilvl w:val="0"/>
-          <w:numId w:val="2"/>
-        </w:numPr>
-        <w:spacing w:after="80"/>
-      </w:pPr>
-      <w:r>
-        <w:t>@BeforeMethod / @AfterMethod — per-test browser setup and teardown for UI tests</w:t>
-      </w:r>
-    </w:p>
-    <w:p>
-      <w:pPr>
-        <w:pStyle w:val="ListParagraph"/>
-        <w:numPr>
-          <w:ilvl w:val="0"/>
-          <w:numId w:val="2"/>
-        </w:numPr>
-        <w:spacing w:after="80"/>
-      </w:pPr>
-      <w:r>
-        <w:t>@BeforeSuite — one-time Excel report initialisation</w:t>
-      </w:r>
-    </w:p>
-    <w:p>
-      <w:pPr>
-        <w:pStyle w:val="ListParagraph"/>
-        <w:numPr>
-          <w:ilvl w:val="0"/>
-          <w:numId w:val="2"/>
-        </w:numPr>
-        <w:spacing w:after="80"/>
-      </w:pPr>
-      <w:r>
-        <w:t>ITestListener / ISuiteListener — lifecycle hooks for reporting</w:t>
-      </w:r>
-    </w:p>
-    <w:p>
-      <w:pPr>
-        <w:pStyle w:val="ListParagraph"/>
-        <w:numPr>
-          <w:ilvl w:val="0"/>
-          <w:numId w:val="2"/>
-        </w:numPr>
-        <w:spacing w:after="80"/>
-      </w:pPr>
-      <w:r>
-        <w:t>dependsOnMethods — declarative test ordering where needed</w:t>
-      </w:r>
-    </w:p>
-    <w:p>
-      <w:pPr>
-        <w:pStyle w:val="Heading2"/>
-      </w:pPr>
-      <w:r>
-        <w:t>5.5 Test Results</w:t>
-      </w:r>
-    </w:p>
-    <w:p>
-      <w:pPr>
-        <w:spacing w:after="120"/>
-      </w:pPr>
-      <w:r>
-        <w:t>The final stable run achieved a 100% pass rate. Earlier development iterations exhibited intermittent flakiness in the Selenium-driven create-ticket form due to timing interactions with Angular's debounced reactive form. This was resolved by rewriting the CreateTicketPage to drive form interactions through JavaScript executor calls, dispatching native input and change events that Angular's change detection picks up deterministically. The lesson — that native browser-level interactions can race against reactive framework state — is itself a valuable engineering artifact from this project.</w:t>
-      </w:r>
-    </w:p>
-    <w:tbl>
-      <w:tblPr>
-        <w:tblW w:w="9360" w:type="dxa"/>
-        <w:tblBorders>
-          <w:top w:val="single" w:sz="4" w:space="0" w:color="auto"/>
-          <w:left w:val="single" w:sz="4" w:space="0" w:color="auto"/>
-          <w:bottom w:val="single" w:sz="4" w:space="0" w:color="auto"/>
-          <w:right w:val="single" w:sz="4" w:space="0" w:color="auto"/>
-          <w:insideH w:val="single" w:sz="4" w:space="0" w:color="auto"/>
-          <w:insideV w:val="single" w:sz="4" w:space="0" w:color="auto"/>
-        </w:tblBorders>
-        <w:tblCellMar>
-          <w:left w:w="10" w:type="dxa"/>
-          <w:right w:w="10" w:type="dxa"/>
-        </w:tblCellMar>
-        <w:tblLook w:val="0000" w:firstRow="0" w:lastRow="0" w:firstColumn="0" w:lastColumn="0" w:noHBand="0" w:noVBand="0"/>
-      </w:tblPr>
-      <w:tblGrid>
-        <w:gridCol w:w="3000"/>
-        <w:gridCol w:w="1500"/>
-        <w:gridCol w:w="1500"/>
-        <w:gridCol w:w="3360"/>
-      </w:tblGrid>
-      <w:tr>
-        <w:tblPrEx>
-          <w:tblCellMar>
-            <w:top w:w="0" w:type="dxa"/>
-            <w:bottom w:w="0" w:type="dxa"/>
-          </w:tblCellMar>
-        </w:tblPrEx>
-        <w:tc>
-          <w:tcPr>
-            <w:tcW w:w="3000" w:type="dxa"/>
-            <w:tcBorders>
-              <w:top w:val="single" w:sz="4" w:space="0" w:color="CCCCCC"/>
-              <w:left w:val="single" w:sz="4" w:space="0" w:color="CCCCCC"/>
-              <w:bottom w:val="single" w:sz="4" w:space="0" w:color="CCCCCC"/>
-              <w:right w:val="single" w:sz="4" w:space="0" w:color="CCCCCC"/>
-            </w:tcBorders>
-            <w:shd w:val="clear" w:color="auto" w:fill="E8E8F0"/>
-            <w:tcMar>
-              <w:top w:w="100" w:type="dxa"/>
-              <w:left w:w="140" w:type="dxa"/>
-              <w:bottom w:w="100" w:type="dxa"/>
-              <w:right w:w="140" w:type="dxa"/>
-            </w:tcMar>
-          </w:tcPr>
-          <w:p>
-            <w:r>
-              <w:rPr>
-                <w:b/>
-                <w:bCs/>
-                <w:sz w:val="20"/>
-                <w:szCs w:val="20"/>
-              </w:rPr>
-              <w:t>Category</w:t>
-            </w:r>
-          </w:p>
-        </w:tc>
-        <w:tc>
-          <w:tcPr>
-            <w:tcW w:w="1500" w:type="dxa"/>
-            <w:tcBorders>
-              <w:top w:val="single" w:sz="4" w:space="0" w:color="CCCCCC"/>
-              <w:left w:val="single" w:sz="4" w:space="0" w:color="CCCCCC"/>
-              <w:bottom w:val="single" w:sz="4" w:space="0" w:color="CCCCCC"/>
-              <w:right w:val="single" w:sz="4" w:space="0" w:color="CCCCCC"/>
-            </w:tcBorders>
-            <w:shd w:val="clear" w:color="auto" w:fill="E8E8F0"/>
-            <w:tcMar>
-              <w:top w:w="100" w:type="dxa"/>
-              <w:left w:w="140" w:type="dxa"/>
-              <w:bottom w:w="100" w:type="dxa"/>
-              <w:right w:w="140" w:type="dxa"/>
-            </w:tcMar>
-          </w:tcPr>
-          <w:p>
-            <w:r>
-              <w:rPr>
-                <w:b/>
-                <w:bCs/>
-                <w:sz w:val="20"/>
-                <w:szCs w:val="20"/>
-              </w:rPr>
-              <w:t>Pass</w:t>
-            </w:r>
-          </w:p>
-        </w:tc>
-        <w:tc>
-          <w:tcPr>
-            <w:tcW w:w="1500" w:type="dxa"/>
-            <w:tcBorders>
-              <w:top w:val="single" w:sz="4" w:space="0" w:color="CCCCCC"/>
-              <w:left w:val="single" w:sz="4" w:space="0" w:color="CCCCCC"/>
-              <w:bottom w:val="single" w:sz="4" w:space="0" w:color="CCCCCC"/>
-              <w:right w:val="single" w:sz="4" w:space="0" w:color="CCCCCC"/>
-            </w:tcBorders>
-            <w:shd w:val="clear" w:color="auto" w:fill="E8E8F0"/>
-            <w:tcMar>
-              <w:top w:w="100" w:type="dxa"/>
-              <w:left w:w="140" w:type="dxa"/>
-              <w:bottom w:w="100" w:type="dxa"/>
-              <w:right w:w="140" w:type="dxa"/>
-            </w:tcMar>
-          </w:tcPr>
-          <w:p>
-            <w:r>
-              <w:rPr>
-                <w:b/>
-                <w:bCs/>
-                <w:sz w:val="20"/>
-                <w:szCs w:val="20"/>
-              </w:rPr>
-              <w:t>Fail</w:t>
-            </w:r>
-          </w:p>
-        </w:tc>
-        <w:tc>
-          <w:tcPr>
-            <w:tcW w:w="3360" w:type="dxa"/>
-            <w:tcBorders>
-              <w:top w:val="single" w:sz="4" w:space="0" w:color="CCCCCC"/>
-              <w:left w:val="single" w:sz="4" w:space="0" w:color="CCCCCC"/>
-              <w:bottom w:val="single" w:sz="4" w:space="0" w:color="CCCCCC"/>
-              <w:right w:val="single" w:sz="4" w:space="0" w:color="CCCCCC"/>
-            </w:tcBorders>
-            <w:shd w:val="clear" w:color="auto" w:fill="E8E8F0"/>
-            <w:tcMar>
-              <w:top w:w="100" w:type="dxa"/>
-              <w:left w:w="140" w:type="dxa"/>
-              <w:bottom w:w="100" w:type="dxa"/>
-              <w:right w:w="140" w:type="dxa"/>
-            </w:tcMar>
-          </w:tcPr>
-          <w:p>
-            <w:r>
-              <w:rPr>
-                <w:b/>
-                <w:bCs/>
-                <w:sz w:val="20"/>
-                <w:szCs w:val="20"/>
-              </w:rPr>
-              <w:t>Pass Rate</w:t>
-            </w:r>
-          </w:p>
-        </w:tc>
-      </w:tr>
-      <w:tr>
-        <w:tblPrEx>
-          <w:tblCellMar>
-            <w:top w:w="0" w:type="dxa"/>
-            <w:bottom w:w="0" w:type="dxa"/>
-          </w:tblCellMar>
-        </w:tblPrEx>
-        <w:tc>
-          <w:tcPr>
-            <w:tcW w:w="3000" w:type="dxa"/>
-            <w:tcBorders>
-              <w:top w:val="single" w:sz="4" w:space="0" w:color="CCCCCC"/>
-              <w:left w:val="single" w:sz="4" w:space="0" w:color="CCCCCC"/>
-              <w:bottom w:val="single" w:sz="4" w:space="0" w:color="CCCCCC"/>
-              <w:right w:val="single" w:sz="4" w:space="0" w:color="CCCCCC"/>
-            </w:tcBorders>
-            <w:tcMar>
-              <w:top w:w="100" w:type="dxa"/>
-              <w:left w:w="140" w:type="dxa"/>
-              <w:bottom w:w="100" w:type="dxa"/>
-              <w:right w:w="140" w:type="dxa"/>
-            </w:tcMar>
-          </w:tcPr>
-          <w:p>
-            <w:r>
-              <w:rPr>
-                <w:sz w:val="20"/>
-                <w:szCs w:val="20"/>
-              </w:rPr>
-              <w:t>REST</w:t>
-            </w:r>
-          </w:p>
-        </w:tc>
-        <w:tc>
-          <w:tcPr>
-            <w:tcW w:w="1500" w:type="dxa"/>
-            <w:tcBorders>
-              <w:top w:val="single" w:sz="4" w:space="0" w:color="CCCCCC"/>
-              <w:left w:val="single" w:sz="4" w:space="0" w:color="CCCCCC"/>
-              <w:bottom w:val="single" w:sz="4" w:space="0" w:color="CCCCCC"/>
-              <w:right w:val="single" w:sz="4" w:space="0" w:color="CCCCCC"/>
-            </w:tcBorders>
-            <w:tcMar>
-              <w:top w:w="100" w:type="dxa"/>
-              <w:left w:w="140" w:type="dxa"/>
-              <w:bottom w:w="100" w:type="dxa"/>
-              <w:right w:w="140" w:type="dxa"/>
-            </w:tcMar>
-          </w:tcPr>
-          <w:p>
-            <w:r>
-              <w:rPr>
-                <w:sz w:val="20"/>
-                <w:szCs w:val="20"/>
-              </w:rPr>
-              <w:t>14</w:t>
-            </w:r>
-          </w:p>
-        </w:tc>
-        <w:tc>
-          <w:tcPr>
-            <w:tcW w:w="1500" w:type="dxa"/>
-            <w:tcBorders>
-              <w:top w:val="single" w:sz="4" w:space="0" w:color="CCCCCC"/>
-              <w:left w:val="single" w:sz="4" w:space="0" w:color="CCCCCC"/>
-              <w:bottom w:val="single" w:sz="4" w:space="0" w:color="CCCCCC"/>
-              <w:right w:val="single" w:sz="4" w:space="0" w:color="CCCCCC"/>
-            </w:tcBorders>
-            <w:tcMar>
-              <w:top w:w="100" w:type="dxa"/>
-              <w:left w:w="140" w:type="dxa"/>
-              <w:bottom w:w="100" w:type="dxa"/>
-              <w:right w:w="140" w:type="dxa"/>
-            </w:tcMar>
-          </w:tcPr>
-          <w:p>
-            <w:r>
-              <w:rPr>
-                <w:sz w:val="20"/>
-                <w:szCs w:val="20"/>
-              </w:rPr>
-              <w:t>0</w:t>
-            </w:r>
-          </w:p>
-        </w:tc>
-        <w:tc>
-          <w:tcPr>
-            <w:tcW w:w="3360" w:type="dxa"/>
-            <w:tcBorders>
-              <w:top w:val="single" w:sz="4" w:space="0" w:color="CCCCCC"/>
-              <w:left w:val="single" w:sz="4" w:space="0" w:color="CCCCCC"/>
-              <w:bottom w:val="single" w:sz="4" w:space="0" w:color="CCCCCC"/>
-              <w:right w:val="single" w:sz="4" w:space="0" w:color="CCCCCC"/>
-            </w:tcBorders>
-            <w:tcMar>
-              <w:top w:w="100" w:type="dxa"/>
-              <w:left w:w="140" w:type="dxa"/>
-              <w:bottom w:w="100" w:type="dxa"/>
-              <w:right w:w="140" w:type="dxa"/>
-            </w:tcMar>
-          </w:tcPr>
-          <w:p>
-            <w:r>
-              <w:rPr>
-                <w:sz w:val="20"/>
-                <w:szCs w:val="20"/>
-              </w:rPr>
-              <w:t>100%</w:t>
-            </w:r>
-          </w:p>
-        </w:tc>
-      </w:tr>
-      <w:tr>
-        <w:tblPrEx>
-          <w:tblCellMar>
-            <w:top w:w="0" w:type="dxa"/>
-            <w:bottom w:w="0" w:type="dxa"/>
-          </w:tblCellMar>
-        </w:tblPrEx>
-        <w:tc>
-          <w:tcPr>
-            <w:tcW w:w="3000" w:type="dxa"/>
-            <w:tcBorders>
-              <w:top w:val="single" w:sz="4" w:space="0" w:color="CCCCCC"/>
-              <w:left w:val="single" w:sz="4" w:space="0" w:color="CCCCCC"/>
-              <w:bottom w:val="single" w:sz="4" w:space="0" w:color="CCCCCC"/>
-              <w:right w:val="single" w:sz="4" w:space="0" w:color="CCCCCC"/>
-            </w:tcBorders>
-            <w:tcMar>
-              <w:top w:w="100" w:type="dxa"/>
-              <w:left w:w="140" w:type="dxa"/>
-              <w:bottom w:w="100" w:type="dxa"/>
-              <w:right w:w="140" w:type="dxa"/>
-            </w:tcMar>
-          </w:tcPr>
-          <w:p>
-            <w:r>
-              <w:rPr>
-                <w:sz w:val="20"/>
-                <w:szCs w:val="20"/>
-              </w:rPr>
-              <w:t>RestAssured</w:t>
-            </w:r>
-          </w:p>
-        </w:tc>
-        <w:tc>
-          <w:tcPr>
-            <w:tcW w:w="1500" w:type="dxa"/>
-            <w:tcBorders>
-              <w:top w:val="single" w:sz="4" w:space="0" w:color="CCCCCC"/>
-              <w:left w:val="single" w:sz="4" w:space="0" w:color="CCCCCC"/>
-              <w:bottom w:val="single" w:sz="4" w:space="0" w:color="CCCCCC"/>
-              <w:right w:val="single" w:sz="4" w:space="0" w:color="CCCCCC"/>
-            </w:tcBorders>
-            <w:tcMar>
-              <w:top w:w="100" w:type="dxa"/>
-              <w:left w:w="140" w:type="dxa"/>
-              <w:bottom w:w="100" w:type="dxa"/>
-              <w:right w:w="140" w:type="dxa"/>
-            </w:tcMar>
-          </w:tcPr>
-          <w:p>
-            <w:r>
-              <w:rPr>
-                <w:sz w:val="20"/>
-                <w:szCs w:val="20"/>
-              </w:rPr>
-              <w:t>9</w:t>
-            </w:r>
-          </w:p>
-        </w:tc>
-        <w:tc>
-          <w:tcPr>
-            <w:tcW w:w="1500" w:type="dxa"/>
-            <w:tcBorders>
-              <w:top w:val="single" w:sz="4" w:space="0" w:color="CCCCCC"/>
-              <w:left w:val="single" w:sz="4" w:space="0" w:color="CCCCCC"/>
-              <w:bottom w:val="single" w:sz="4" w:space="0" w:color="CCCCCC"/>
-              <w:right w:val="single" w:sz="4" w:space="0" w:color="CCCCCC"/>
-            </w:tcBorders>
-            <w:tcMar>
-              <w:top w:w="100" w:type="dxa"/>
-              <w:left w:w="140" w:type="dxa"/>
-              <w:bottom w:w="100" w:type="dxa"/>
-              <w:right w:w="140" w:type="dxa"/>
-            </w:tcMar>
-          </w:tcPr>
-          <w:p>
-            <w:r>
-              <w:rPr>
-                <w:sz w:val="20"/>
-                <w:szCs w:val="20"/>
-              </w:rPr>
-              <w:t>0</w:t>
-            </w:r>
-          </w:p>
-        </w:tc>
-        <w:tc>
-          <w:tcPr>
-            <w:tcW w:w="3360" w:type="dxa"/>
-            <w:tcBorders>
-              <w:top w:val="single" w:sz="4" w:space="0" w:color="CCCCCC"/>
-              <w:left w:val="single" w:sz="4" w:space="0" w:color="CCCCCC"/>
-              <w:bottom w:val="single" w:sz="4" w:space="0" w:color="CCCCCC"/>
-              <w:right w:val="single" w:sz="4" w:space="0" w:color="CCCCCC"/>
-            </w:tcBorders>
-            <w:tcMar>
-              <w:top w:w="100" w:type="dxa"/>
-              <w:left w:w="140" w:type="dxa"/>
-              <w:bottom w:w="100" w:type="dxa"/>
-              <w:right w:w="140" w:type="dxa"/>
-            </w:tcMar>
-          </w:tcPr>
-          <w:p>
-            <w:r>
-              <w:rPr>
-                <w:sz w:val="20"/>
-                <w:szCs w:val="20"/>
-              </w:rPr>
-              <w:t>100%</w:t>
-            </w:r>
-          </w:p>
-        </w:tc>
-      </w:tr>
-      <w:tr>
-        <w:tblPrEx>
-          <w:tblCellMar>
-            <w:top w:w="0" w:type="dxa"/>
-            <w:bottom w:w="0" w:type="dxa"/>
-          </w:tblCellMar>
-        </w:tblPrEx>
-        <w:tc>
-          <w:tcPr>
-            <w:tcW w:w="3000" w:type="dxa"/>
-            <w:tcBorders>
-              <w:top w:val="single" w:sz="4" w:space="0" w:color="CCCCCC"/>
-              <w:left w:val="single" w:sz="4" w:space="0" w:color="CCCCCC"/>
-              <w:bottom w:val="single" w:sz="4" w:space="0" w:color="CCCCCC"/>
-              <w:right w:val="single" w:sz="4" w:space="0" w:color="CCCCCC"/>
-            </w:tcBorders>
-            <w:tcMar>
-              <w:top w:w="100" w:type="dxa"/>
-              <w:left w:w="140" w:type="dxa"/>
-              <w:bottom w:w="100" w:type="dxa"/>
-              <w:right w:w="140" w:type="dxa"/>
-            </w:tcMar>
-          </w:tcPr>
-          <w:p>
-            <w:r>
-              <w:rPr>
-                <w:sz w:val="20"/>
-                <w:szCs w:val="20"/>
-              </w:rPr>
-              <w:lastRenderedPageBreak/>
-              <w:t>SOAP</w:t>
-            </w:r>
-          </w:p>
-        </w:tc>
-        <w:tc>
-          <w:tcPr>
-            <w:tcW w:w="1500" w:type="dxa"/>
-            <w:tcBorders>
-              <w:top w:val="single" w:sz="4" w:space="0" w:color="CCCCCC"/>
-              <w:left w:val="single" w:sz="4" w:space="0" w:color="CCCCCC"/>
-              <w:bottom w:val="single" w:sz="4" w:space="0" w:color="CCCCCC"/>
-              <w:right w:val="single" w:sz="4" w:space="0" w:color="CCCCCC"/>
-            </w:tcBorders>
-            <w:tcMar>
-              <w:top w:w="100" w:type="dxa"/>
-              <w:left w:w="140" w:type="dxa"/>
-              <w:bottom w:w="100" w:type="dxa"/>
-              <w:right w:w="140" w:type="dxa"/>
-            </w:tcMar>
-          </w:tcPr>
-          <w:p>
-            <w:r>
-              <w:rPr>
-                <w:sz w:val="20"/>
-                <w:szCs w:val="20"/>
-              </w:rPr>
-              <w:t>5</w:t>
-            </w:r>
-          </w:p>
-        </w:tc>
-        <w:tc>
-          <w:tcPr>
-            <w:tcW w:w="1500" w:type="dxa"/>
-            <w:tcBorders>
-              <w:top w:val="single" w:sz="4" w:space="0" w:color="CCCCCC"/>
-              <w:left w:val="single" w:sz="4" w:space="0" w:color="CCCCCC"/>
-              <w:bottom w:val="single" w:sz="4" w:space="0" w:color="CCCCCC"/>
-              <w:right w:val="single" w:sz="4" w:space="0" w:color="CCCCCC"/>
-            </w:tcBorders>
-            <w:tcMar>
-              <w:top w:w="100" w:type="dxa"/>
-              <w:left w:w="140" w:type="dxa"/>
-              <w:bottom w:w="100" w:type="dxa"/>
-              <w:right w:w="140" w:type="dxa"/>
-            </w:tcMar>
-          </w:tcPr>
-          <w:p>
-            <w:r>
-              <w:rPr>
-                <w:sz w:val="20"/>
-                <w:szCs w:val="20"/>
-              </w:rPr>
-              <w:t>0</w:t>
-            </w:r>
-          </w:p>
-        </w:tc>
-        <w:tc>
-          <w:tcPr>
-            <w:tcW w:w="3360" w:type="dxa"/>
-            <w:tcBorders>
-              <w:top w:val="single" w:sz="4" w:space="0" w:color="CCCCCC"/>
-              <w:left w:val="single" w:sz="4" w:space="0" w:color="CCCCCC"/>
-              <w:bottom w:val="single" w:sz="4" w:space="0" w:color="CCCCCC"/>
-              <w:right w:val="single" w:sz="4" w:space="0" w:color="CCCCCC"/>
-            </w:tcBorders>
-            <w:tcMar>
-              <w:top w:w="100" w:type="dxa"/>
-              <w:left w:w="140" w:type="dxa"/>
-              <w:bottom w:w="100" w:type="dxa"/>
-              <w:right w:w="140" w:type="dxa"/>
-            </w:tcMar>
-          </w:tcPr>
-          <w:p>
-            <w:r>
-              <w:rPr>
-                <w:sz w:val="20"/>
-                <w:szCs w:val="20"/>
-              </w:rPr>
-              <w:t>100%</w:t>
-            </w:r>
-          </w:p>
-        </w:tc>
-      </w:tr>
-      <w:tr>
-        <w:tblPrEx>
-          <w:tblCellMar>
-            <w:top w:w="0" w:type="dxa"/>
-            <w:bottom w:w="0" w:type="dxa"/>
-          </w:tblCellMar>
-        </w:tblPrEx>
-        <w:tc>
-          <w:tcPr>
-            <w:tcW w:w="3000" w:type="dxa"/>
-            <w:tcBorders>
-              <w:top w:val="single" w:sz="4" w:space="0" w:color="CCCCCC"/>
-              <w:left w:val="single" w:sz="4" w:space="0" w:color="CCCCCC"/>
-              <w:bottom w:val="single" w:sz="4" w:space="0" w:color="CCCCCC"/>
-              <w:right w:val="single" w:sz="4" w:space="0" w:color="CCCCCC"/>
-            </w:tcBorders>
-            <w:tcMar>
-              <w:top w:w="100" w:type="dxa"/>
-              <w:left w:w="140" w:type="dxa"/>
-              <w:bottom w:w="100" w:type="dxa"/>
-              <w:right w:w="140" w:type="dxa"/>
-            </w:tcMar>
-          </w:tcPr>
-          <w:p>
-            <w:r>
-              <w:rPr>
-                <w:sz w:val="20"/>
-                <w:szCs w:val="20"/>
-              </w:rPr>
-              <w:t>UI-Selenium</w:t>
-            </w:r>
-          </w:p>
-        </w:tc>
-        <w:tc>
-          <w:tcPr>
-            <w:tcW w:w="1500" w:type="dxa"/>
-            <w:tcBorders>
-              <w:top w:val="single" w:sz="4" w:space="0" w:color="CCCCCC"/>
-              <w:left w:val="single" w:sz="4" w:space="0" w:color="CCCCCC"/>
-              <w:bottom w:val="single" w:sz="4" w:space="0" w:color="CCCCCC"/>
-              <w:right w:val="single" w:sz="4" w:space="0" w:color="CCCCCC"/>
-            </w:tcBorders>
-            <w:tcMar>
-              <w:top w:w="100" w:type="dxa"/>
-              <w:left w:w="140" w:type="dxa"/>
-              <w:bottom w:w="100" w:type="dxa"/>
-              <w:right w:w="140" w:type="dxa"/>
-            </w:tcMar>
-          </w:tcPr>
-          <w:p>
-            <w:r>
-              <w:rPr>
-                <w:sz w:val="20"/>
-                <w:szCs w:val="20"/>
-              </w:rPr>
-              <w:t>11</w:t>
-            </w:r>
-          </w:p>
-        </w:tc>
-        <w:tc>
-          <w:tcPr>
-            <w:tcW w:w="1500" w:type="dxa"/>
-            <w:tcBorders>
-              <w:top w:val="single" w:sz="4" w:space="0" w:color="CCCCCC"/>
-              <w:left w:val="single" w:sz="4" w:space="0" w:color="CCCCCC"/>
-              <w:bottom w:val="single" w:sz="4" w:space="0" w:color="CCCCCC"/>
-              <w:right w:val="single" w:sz="4" w:space="0" w:color="CCCCCC"/>
-            </w:tcBorders>
-            <w:tcMar>
-              <w:top w:w="100" w:type="dxa"/>
-              <w:left w:w="140" w:type="dxa"/>
-              <w:bottom w:w="100" w:type="dxa"/>
-              <w:right w:w="140" w:type="dxa"/>
-            </w:tcMar>
-          </w:tcPr>
-          <w:p>
-            <w:r>
-              <w:rPr>
-                <w:sz w:val="20"/>
-                <w:szCs w:val="20"/>
-              </w:rPr>
-              <w:t>0</w:t>
-            </w:r>
-          </w:p>
-        </w:tc>
-        <w:tc>
-          <w:tcPr>
-            <w:tcW w:w="3360" w:type="dxa"/>
-            <w:tcBorders>
-              <w:top w:val="single" w:sz="4" w:space="0" w:color="CCCCCC"/>
-              <w:left w:val="single" w:sz="4" w:space="0" w:color="CCCCCC"/>
-              <w:bottom w:val="single" w:sz="4" w:space="0" w:color="CCCCCC"/>
-              <w:right w:val="single" w:sz="4" w:space="0" w:color="CCCCCC"/>
-            </w:tcBorders>
-            <w:tcMar>
-              <w:top w:w="100" w:type="dxa"/>
-              <w:left w:w="140" w:type="dxa"/>
-              <w:bottom w:w="100" w:type="dxa"/>
-              <w:right w:w="140" w:type="dxa"/>
-            </w:tcMar>
-          </w:tcPr>
-          <w:p>
-            <w:r>
-              <w:rPr>
-                <w:sz w:val="20"/>
-                <w:szCs w:val="20"/>
-              </w:rPr>
-              <w:t>100%</w:t>
-            </w:r>
-          </w:p>
-        </w:tc>
-      </w:tr>
-      <w:tr>
-        <w:tblPrEx>
-          <w:tblCellMar>
-            <w:top w:w="0" w:type="dxa"/>
-            <w:bottom w:w="0" w:type="dxa"/>
-          </w:tblCellMar>
-        </w:tblPrEx>
-        <w:tc>
-          <w:tcPr>
-            <w:tcW w:w="3000" w:type="dxa"/>
-            <w:tcBorders>
-              <w:top w:val="single" w:sz="4" w:space="0" w:color="CCCCCC"/>
-              <w:left w:val="single" w:sz="4" w:space="0" w:color="CCCCCC"/>
-              <w:bottom w:val="single" w:sz="4" w:space="0" w:color="CCCCCC"/>
-              <w:right w:val="single" w:sz="4" w:space="0" w:color="CCCCCC"/>
-            </w:tcBorders>
-            <w:tcMar>
-              <w:top w:w="100" w:type="dxa"/>
-              <w:left w:w="140" w:type="dxa"/>
-              <w:bottom w:w="100" w:type="dxa"/>
-              <w:right w:w="140" w:type="dxa"/>
-            </w:tcMar>
-          </w:tcPr>
-          <w:p>
-            <w:r>
-              <w:rPr>
-                <w:sz w:val="20"/>
-                <w:szCs w:val="20"/>
-              </w:rPr>
-              <w:t>Cucumber-BDD</w:t>
-            </w:r>
-          </w:p>
-        </w:tc>
-        <w:tc>
-          <w:tcPr>
-            <w:tcW w:w="1500" w:type="dxa"/>
-            <w:tcBorders>
-              <w:top w:val="single" w:sz="4" w:space="0" w:color="CCCCCC"/>
-              <w:left w:val="single" w:sz="4" w:space="0" w:color="CCCCCC"/>
-              <w:bottom w:val="single" w:sz="4" w:space="0" w:color="CCCCCC"/>
-              <w:right w:val="single" w:sz="4" w:space="0" w:color="CCCCCC"/>
-            </w:tcBorders>
-            <w:tcMar>
-              <w:top w:w="100" w:type="dxa"/>
-              <w:left w:w="140" w:type="dxa"/>
-              <w:bottom w:w="100" w:type="dxa"/>
-              <w:right w:w="140" w:type="dxa"/>
-            </w:tcMar>
-          </w:tcPr>
-          <w:p>
-            <w:r>
-              <w:rPr>
-                <w:sz w:val="20"/>
-                <w:szCs w:val="20"/>
-              </w:rPr>
-              <w:t>10</w:t>
-            </w:r>
-          </w:p>
-        </w:tc>
-        <w:tc>
-          <w:tcPr>
-            <w:tcW w:w="1500" w:type="dxa"/>
-            <w:tcBorders>
-              <w:top w:val="single" w:sz="4" w:space="0" w:color="CCCCCC"/>
-              <w:left w:val="single" w:sz="4" w:space="0" w:color="CCCCCC"/>
-              <w:bottom w:val="single" w:sz="4" w:space="0" w:color="CCCCCC"/>
-              <w:right w:val="single" w:sz="4" w:space="0" w:color="CCCCCC"/>
-            </w:tcBorders>
-            <w:tcMar>
-              <w:top w:w="100" w:type="dxa"/>
-              <w:left w:w="140" w:type="dxa"/>
-              <w:bottom w:w="100" w:type="dxa"/>
-              <w:right w:w="140" w:type="dxa"/>
-            </w:tcMar>
-          </w:tcPr>
-          <w:p>
-            <w:r>
-              <w:rPr>
-                <w:sz w:val="20"/>
-                <w:szCs w:val="20"/>
-              </w:rPr>
-              <w:t>0</w:t>
-            </w:r>
-          </w:p>
-        </w:tc>
-        <w:tc>
-          <w:tcPr>
-            <w:tcW w:w="3360" w:type="dxa"/>
-            <w:tcBorders>
-              <w:top w:val="single" w:sz="4" w:space="0" w:color="CCCCCC"/>
-              <w:left w:val="single" w:sz="4" w:space="0" w:color="CCCCCC"/>
-              <w:bottom w:val="single" w:sz="4" w:space="0" w:color="CCCCCC"/>
-              <w:right w:val="single" w:sz="4" w:space="0" w:color="CCCCCC"/>
-            </w:tcBorders>
-            <w:tcMar>
-              <w:top w:w="100" w:type="dxa"/>
-              <w:left w:w="140" w:type="dxa"/>
-              <w:bottom w:w="100" w:type="dxa"/>
-              <w:right w:w="140" w:type="dxa"/>
-            </w:tcMar>
-          </w:tcPr>
-          <w:p>
-            <w:r>
-              <w:rPr>
-                <w:sz w:val="20"/>
-                <w:szCs w:val="20"/>
-              </w:rPr>
-              <w:t>100%</w:t>
-            </w:r>
-          </w:p>
-        </w:tc>
-      </w:tr>
-      <w:tr>
-        <w:tblPrEx>
-          <w:tblCellMar>
-            <w:top w:w="0" w:type="dxa"/>
-            <w:bottom w:w="0" w:type="dxa"/>
-          </w:tblCellMar>
-        </w:tblPrEx>
-        <w:tc>
-          <w:tcPr>
-            <w:tcW w:w="3000" w:type="dxa"/>
-            <w:tcBorders>
-              <w:top w:val="single" w:sz="4" w:space="0" w:color="CCCCCC"/>
-              <w:left w:val="single" w:sz="4" w:space="0" w:color="CCCCCC"/>
-              <w:bottom w:val="single" w:sz="4" w:space="0" w:color="CCCCCC"/>
-              <w:right w:val="single" w:sz="4" w:space="0" w:color="CCCCCC"/>
-            </w:tcBorders>
-            <w:tcMar>
-              <w:top w:w="100" w:type="dxa"/>
-              <w:left w:w="140" w:type="dxa"/>
-              <w:bottom w:w="100" w:type="dxa"/>
-              <w:right w:w="140" w:type="dxa"/>
-            </w:tcMar>
-          </w:tcPr>
-          <w:p>
-            <w:r>
-              <w:rPr>
-                <w:sz w:val="20"/>
-                <w:szCs w:val="20"/>
-              </w:rPr>
-              <w:t>TOTAL</w:t>
-            </w:r>
-          </w:p>
-        </w:tc>
-        <w:tc>
-          <w:tcPr>
-            <w:tcW w:w="1500" w:type="dxa"/>
-            <w:tcBorders>
-              <w:top w:val="single" w:sz="4" w:space="0" w:color="CCCCCC"/>
-              <w:left w:val="single" w:sz="4" w:space="0" w:color="CCCCCC"/>
-              <w:bottom w:val="single" w:sz="4" w:space="0" w:color="CCCCCC"/>
-              <w:right w:val="single" w:sz="4" w:space="0" w:color="CCCCCC"/>
-            </w:tcBorders>
-            <w:tcMar>
-              <w:top w:w="100" w:type="dxa"/>
-              <w:left w:w="140" w:type="dxa"/>
-              <w:bottom w:w="100" w:type="dxa"/>
-              <w:right w:w="140" w:type="dxa"/>
-            </w:tcMar>
-          </w:tcPr>
-          <w:p>
-            <w:r>
-              <w:rPr>
-                <w:sz w:val="20"/>
-                <w:szCs w:val="20"/>
-              </w:rPr>
-              <w:t>49</w:t>
-            </w:r>
-          </w:p>
-        </w:tc>
-        <w:tc>
-          <w:tcPr>
-            <w:tcW w:w="1500" w:type="dxa"/>
-            <w:tcBorders>
-              <w:top w:val="single" w:sz="4" w:space="0" w:color="CCCCCC"/>
-              <w:left w:val="single" w:sz="4" w:space="0" w:color="CCCCCC"/>
-              <w:bottom w:val="single" w:sz="4" w:space="0" w:color="CCCCCC"/>
-              <w:right w:val="single" w:sz="4" w:space="0" w:color="CCCCCC"/>
-            </w:tcBorders>
-            <w:tcMar>
-              <w:top w:w="100" w:type="dxa"/>
-              <w:left w:w="140" w:type="dxa"/>
-              <w:bottom w:w="100" w:type="dxa"/>
-              <w:right w:w="140" w:type="dxa"/>
-            </w:tcMar>
-          </w:tcPr>
-          <w:p>
-            <w:r>
-              <w:rPr>
-                <w:sz w:val="20"/>
-                <w:szCs w:val="20"/>
-              </w:rPr>
-              <w:t>0</w:t>
-            </w:r>
-          </w:p>
-        </w:tc>
-        <w:tc>
-          <w:tcPr>
-            <w:tcW w:w="3360" w:type="dxa"/>
-            <w:tcBorders>
-              <w:top w:val="single" w:sz="4" w:space="0" w:color="CCCCCC"/>
-              <w:left w:val="single" w:sz="4" w:space="0" w:color="CCCCCC"/>
-              <w:bottom w:val="single" w:sz="4" w:space="0" w:color="CCCCCC"/>
-              <w:right w:val="single" w:sz="4" w:space="0" w:color="CCCCCC"/>
-            </w:tcBorders>
-            <w:tcMar>
-              <w:top w:w="100" w:type="dxa"/>
-              <w:left w:w="140" w:type="dxa"/>
-              <w:bottom w:w="100" w:type="dxa"/>
-              <w:right w:w="140" w:type="dxa"/>
-            </w:tcMar>
-          </w:tcPr>
-          <w:p>
-            <w:r>
-              <w:rPr>
-                <w:sz w:val="20"/>
-                <w:szCs w:val="20"/>
-              </w:rPr>
-              <w:t>100%</w:t>
-            </w:r>
-          </w:p>
-        </w:tc>
-      </w:tr>
-    </w:tbl>
-    <w:p>
-      <w:pPr>
-        <w:pStyle w:val="Heading2"/>
-      </w:pPr>
-      <w:r>
-        <w:t>5.6 Reporting Outputs</w:t>
-      </w:r>
-    </w:p>
-    <w:p>
-      <w:pPr>
-        <w:spacing w:after="120"/>
-      </w:pPr>
-      <w:r>
-        <w:t>The suite produces three complementary reports for review:</w:t>
-      </w:r>
-    </w:p>
-    <w:p>
-      <w:pPr>
-        <w:pStyle w:val="ListParagraph"/>
-        <w:numPr>
-          <w:ilvl w:val="0"/>
-          <w:numId w:val="2"/>
-        </w:numPr>
-        <w:spacing w:after="80"/>
-      </w:pPr>
-      <w:r>
-        <w:t>Custom Excel report at target/test-results/Test_Results_&lt;timestamp&gt;.xlsx — one sheet per technology category, with PASS rows in green and FAIL rows in red, written via Apache POI</w:t>
-      </w:r>
-    </w:p>
-    <w:p>
-      <w:pPr>
-        <w:pStyle w:val="ListParagraph"/>
-        <w:numPr>
-          <w:ilvl w:val="0"/>
-          <w:numId w:val="2"/>
-        </w:numPr>
-        <w:spacing w:after="80"/>
-      </w:pPr>
-      <w:r>
-        <w:t>TestNG HTML report at target/surefire-reports/index.html — auto-generated by the Surefire plugin, including execution timing and stack traces for any failures</w:t>
-      </w:r>
-    </w:p>
-    <w:p>
-      <w:pPr>
-        <w:pStyle w:val="ListParagraph"/>
-        <w:numPr>
-          <w:ilvl w:val="0"/>
-          <w:numId w:val="2"/>
-        </w:numPr>
-        <w:spacing w:after="80"/>
-      </w:pPr>
-      <w:r>
-        <w:t>Cucumber HTML report — generated by the Cucumber plugin, showing scenarios and step-by-step pass/fail with parameter values</w:t>
-      </w:r>
-    </w:p>
-    <w:p>
-      <w:r>
-        <w:br w:type="page"/>
-      </w:r>
-    </w:p>
-    <w:p>
-      <w:pPr>
-        <w:pStyle w:val="Heading1"/>
-      </w:pPr>
-      <w:r>
-        <w:lastRenderedPageBreak/>
         <w:t>6. Overall System Architecture</w:t>
       </w:r>
     </w:p>
@@ -10163,12 +6829,6 @@
         <w:gridCol w:w="4360"/>
       </w:tblGrid>
       <w:tr>
-        <w:tblPrEx>
-          <w:tblCellMar>
-            <w:top w:w="0" w:type="dxa"/>
-            <w:bottom w:w="0" w:type="dxa"/>
-          </w:tblCellMar>
-        </w:tblPrEx>
         <w:tc>
           <w:tcPr>
             <w:tcW w:w="1500" w:type="dxa"/>
@@ -10258,12 +6918,6 @@
         </w:tc>
       </w:tr>
       <w:tr>
-        <w:tblPrEx>
-          <w:tblCellMar>
-            <w:top w:w="0" w:type="dxa"/>
-            <w:bottom w:w="0" w:type="dxa"/>
-          </w:tblCellMar>
-        </w:tblPrEx>
         <w:tc>
           <w:tcPr>
             <w:tcW w:w="1500" w:type="dxa"/>
@@ -10344,12 +6998,6 @@
         </w:tc>
       </w:tr>
       <w:tr>
-        <w:tblPrEx>
-          <w:tblCellMar>
-            <w:top w:w="0" w:type="dxa"/>
-            <w:bottom w:w="0" w:type="dxa"/>
-          </w:tblCellMar>
-        </w:tblPrEx>
         <w:tc>
           <w:tcPr>
             <w:tcW w:w="1500" w:type="dxa"/>
@@ -10430,12 +7078,6 @@
         </w:tc>
       </w:tr>
       <w:tr>
-        <w:tblPrEx>
-          <w:tblCellMar>
-            <w:top w:w="0" w:type="dxa"/>
-            <w:bottom w:w="0" w:type="dxa"/>
-          </w:tblCellMar>
-        </w:tblPrEx>
         <w:tc>
           <w:tcPr>
             <w:tcW w:w="1500" w:type="dxa"/>
@@ -10516,12 +7158,6 @@
         </w:tc>
       </w:tr>
       <w:tr>
-        <w:tblPrEx>
-          <w:tblCellMar>
-            <w:top w:w="0" w:type="dxa"/>
-            <w:bottom w:w="0" w:type="dxa"/>
-          </w:tblCellMar>
-        </w:tblPrEx>
         <w:tc>
           <w:tcPr>
             <w:tcW w:w="1500" w:type="dxa"/>
@@ -10602,12 +7238,6 @@
         </w:tc>
       </w:tr>
       <w:tr>
-        <w:tblPrEx>
-          <w:tblCellMar>
-            <w:top w:w="0" w:type="dxa"/>
-            <w:bottom w:w="0" w:type="dxa"/>
-          </w:tblCellMar>
-        </w:tblPrEx>
         <w:tc>
           <w:tcPr>
             <w:tcW w:w="1500" w:type="dxa"/>
@@ -10701,6 +7331,7 @@
         <w:spacing w:after="120"/>
       </w:pPr>
       <w:r>
+        <w:lastRenderedPageBreak/>
         <w:t>To illustrate how the layers interact, consider a user creating a new ticket via the UI:</w:t>
       </w:r>
     </w:p>
@@ -10938,7 +7569,6 @@
         <w:spacing w:after="80"/>
       </w:pPr>
       <w:r>
-        <w:lastRenderedPageBreak/>
         <w:t>Passwords stored using BCrypt with default cost factor — even database compromise does not leak plaintext credentials</w:t>
       </w:r>
     </w:p>

</xml_diff>